<commit_message>
feat: Phase 9B provider/settings stabilization
- Add LlmSettings and ResolvedSettings types to contracts
- Create ProviderResolutionService for centralized provider resolution
- Implement settings merge-save functionality
- Add API key management per provider
- Update run-service to use resolved settings
- Update spec and roadmap documents
- Add comprehensive tests for provider resolution
</commit_message>
<xml_diff>
--- a/claw.docx
+++ b/claw.docx
@@ -3,40 +3,147 @@
 <w:document xmlns:wpc="http://schemas.microsoft.com/office/word/2010/wordprocessingCanvas" xmlns:cx="http://schemas.microsoft.com/office/drawing/2014/chartex" xmlns:cx1="http://schemas.microsoft.com/office/drawing/2015/9/8/chartex" xmlns:cx2="http://schemas.microsoft.com/office/drawing/2015/10/21/chartex" xmlns:cx3="http://schemas.microsoft.com/office/drawing/2016/5/9/chartex" xmlns:cx4="http://schemas.microsoft.com/office/drawing/2016/5/10/chartex" xmlns:cx5="http://schemas.microsoft.com/office/drawing/2016/5/11/chartex" xmlns:cx6="http://schemas.microsoft.com/office/drawing/2016/5/12/chartex" xmlns:cx7="http://schemas.microsoft.com/office/drawing/2016/5/13/chartex" xmlns:cx8="http://schemas.microsoft.com/office/drawing/2016/5/14/chartex" xmlns:mc="http://schemas.openxmlformats.org/markup-compatibility/2006" xmlns:aink="http://schemas.microsoft.com/office/drawing/2016/ink" xmlns:am3d="http://schemas.microsoft.com/office/drawing/2017/model3d" xmlns:o="urn:schemas-microsoft-com:office:office" xmlns:oel="http://schemas.microsoft.com/office/2019/extlst" xmlns:r="http://schemas.openxmlformats.org/officeDocument/2006/relationships" xmlns:m="http://schemas.openxmlformats.org/officeDocument/2006/math" xmlns:v="urn:schemas-microsoft-com:vml" xmlns:wp14="http://schemas.microsoft.com/office/word/2010/wordprocessingDrawing" xmlns:wp="http://schemas.openxmlformats.org/drawingml/2006/wordprocessingDrawing" xmlns:w10="urn:schemas-microsoft-com:office:word" xmlns:w="http://schemas.openxmlformats.org/wordprocessingml/2006/main" xmlns:w14="http://schemas.microsoft.com/office/word/2010/wordml" xmlns:w15="http://schemas.microsoft.com/office/word/2012/wordml" xmlns:w16cex="http://schemas.microsoft.com/office/word/2018/wordml/cex" xmlns:w16cid="http://schemas.microsoft.com/office/word/2016/wordml/cid" xmlns:w16="http://schemas.microsoft.com/office/word/2018/wordml" xmlns:w16du="http://schemas.microsoft.com/office/word/2023/wordml/word16du" xmlns:w16sdtdh="http://schemas.microsoft.com/office/word/2020/wordml/sdtdatahash" xmlns:w16sdtfl="http://schemas.microsoft.com/office/word/2024/wordml/sdtformatlock" xmlns:w16se="http://schemas.microsoft.com/office/word/2015/wordml/symex" xmlns:wpg="http://schemas.microsoft.com/office/word/2010/wordprocessingGroup" xmlns:wpi="http://schemas.microsoft.com/office/word/2010/wordprocessingInk" xmlns:wne="http://schemas.microsoft.com/office/word/2006/wordml" xmlns:wps="http://schemas.microsoft.com/office/word/2010/wordprocessingShape" mc:Ignorable="w14 w15 w16se w16cid w16 w16cex w16sdtdh w16sdtfl w16du wp14">
   <w:body>
     <w:p>
-      <w:r>
-        <w:t>Read the latest committed `docs/claw-handover-spec.en.md` from `main` before making implementation or design decisions. If this chat changes the spec, update both `docs/claw-handover-spec.md` and `docs/claw-handover-spec.en.md` before or alongside implementation.</w:t>
-      </w:r>
-    </w:p>
-    <w:p>
-      <w:r>
-        <w:t>`docs/claw-handover-spec.en.md` is now committed on `main`.</w:t>
+      <w:pPr>
+        <w:rPr>
+          <w:rFonts w:hint="eastAsia"/>
+        </w:rPr>
+      </w:pPr>
+      <w:r>
+        <w:t>このチャットを7代目のプロジェクト運用設計提案チャットとして運用します</w:t>
       </w:r>
     </w:p>
     <w:p/>
     <w:p>
       <w:r>
-        <w:t>Path:</w:t>
-      </w:r>
-    </w:p>
-    <w:p>
-      <w:r>
-        <w:t>`docs/claw-handover-spec.en.md`</w:t>
+        <w:rPr>
+          <w:rFonts w:eastAsia="ＭＳ Ｐゴシック"/>
+        </w:rPr>
+        <w:t>実装や設計の決定をする前に、最新のコミット済み「</w:t>
+      </w:r>
+      <w:r>
+        <w:rPr>
+          <w:rFonts w:eastAsia="ＭＳ Ｐゴシック"/>
+        </w:rPr>
+        <w:t>docs/claw-handover-spec.en.md</w:t>
+      </w:r>
+      <w:r>
+        <w:rPr>
+          <w:rFonts w:eastAsia="ＭＳ Ｐゴシック"/>
+        </w:rPr>
+        <w:t>」を「</w:t>
+      </w:r>
+      <w:r>
+        <w:rPr>
+          <w:rFonts w:eastAsia="ＭＳ Ｐゴシック"/>
+        </w:rPr>
+        <w:t>main</w:t>
+      </w:r>
+      <w:r>
+        <w:rPr>
+          <w:rFonts w:eastAsia="ＭＳ Ｐゴシック"/>
+        </w:rPr>
+        <w:t>」から読みましょう。このチャットで仕様が変わる場合は、実装の前または同時に「</w:t>
+      </w:r>
+      <w:r>
+        <w:rPr>
+          <w:rFonts w:eastAsia="ＭＳ Ｐゴシック"/>
+        </w:rPr>
+        <w:t>docs/claw-handover-spec.en.md</w:t>
+      </w:r>
+      <w:r>
+        <w:rPr>
+          <w:rFonts w:eastAsia="ＭＳ Ｐゴシック"/>
+        </w:rPr>
+        <w:t>」と「</w:t>
+      </w:r>
+      <w:r>
+        <w:rPr>
+          <w:rFonts w:eastAsia="ＭＳ Ｐゴシック"/>
+        </w:rPr>
+        <w:t>docs/claw-handover-spec.en.md</w:t>
+      </w:r>
+      <w:r>
+        <w:rPr>
+          <w:rFonts w:eastAsia="ＭＳ Ｐゴシック"/>
+        </w:rPr>
+        <w:t>」の両方を更新してください。</w:t>
+      </w:r>
+    </w:p>
+    <w:p>
+      <w:r>
+        <w:rPr>
+          <w:rFonts w:eastAsia="ＭＳ Ｐゴシック"/>
+        </w:rPr>
+        <w:t>「</w:t>
+      </w:r>
+      <w:r>
+        <w:rPr>
+          <w:rFonts w:eastAsia="ＭＳ Ｐゴシック"/>
+        </w:rPr>
+        <w:t>docs/claw-handover-spec.en.md</w:t>
+      </w:r>
+      <w:r>
+        <w:rPr>
+          <w:rFonts w:eastAsia="ＭＳ Ｐゴシック"/>
+        </w:rPr>
+        <w:t>」は現在「</w:t>
+      </w:r>
+      <w:r>
+        <w:rPr>
+          <w:rFonts w:eastAsia="ＭＳ Ｐゴシック"/>
+        </w:rPr>
+        <w:t>main</w:t>
+      </w:r>
+      <w:r>
+        <w:rPr>
+          <w:rFonts w:eastAsia="ＭＳ Ｐゴシック"/>
+        </w:rPr>
+        <w:t>」にコミットされています。</w:t>
       </w:r>
     </w:p>
     <w:p/>
     <w:p>
       <w:r>
-        <w:t>Commit:</w:t>
-      </w:r>
-    </w:p>
-    <w:p>
-      <w:r>
-        <w:t>`e9b1502c7dd55781307faf2bdadea32bd9cd74c6`</w:t>
+        <w:rPr>
+          <w:rFonts w:eastAsia="SimSun"/>
+        </w:rPr>
+        <w:t>経路</w:t>
+      </w:r>
+      <w:r>
+        <w:rPr>
+          <w:rFonts w:eastAsia="SimSun"/>
+        </w:rPr>
+        <w:t>:</w:t>
+      </w:r>
+    </w:p>
+    <w:p>
+      <w:r>
+        <w:t>'docs/claw-handover-spec.en.md'</w:t>
       </w:r>
     </w:p>
     <w:p/>
     <w:p>
       <w:r>
+        <w:rPr>
+          <w:rFonts w:eastAsia="ＭＳ Ｐゴシック"/>
+        </w:rPr>
+        <w:t>コミットすること</w:t>
+      </w:r>
+      <w:r>
+        <w:rPr>
+          <w:rFonts w:eastAsia="ＭＳ Ｐゴシック"/>
+        </w:rPr>
+        <w:t>:</w:t>
+      </w:r>
+    </w:p>
+    <w:p>
+      <w:r>
+        <w:t>'e9B1502C7dd55781307faf2bdadea32bd9cd74c6'</w:t>
+      </w:r>
+    </w:p>
+    <w:p/>
+    <w:p>
+      <w:r>
         <w:t>URL:</w:t>
       </w:r>
     </w:p>
@@ -44,10 +151,165 @@
       <w:r>
         <w:t>https://github.com/tomo2222jp/claw-code/blob/main/docs/claw-handover-spec.en.md</w:t>
       </w:r>
+    </w:p>
+    <w:p/>
+    <w:p>
+      <w:r>
+        <w:rPr>
+          <w:rFonts w:hint="eastAsia"/>
+        </w:rPr>
+        <w:t>roadmap</w:t>
+      </w:r>
+    </w:p>
+    <w:p/>
+    <w:p>
+      <w:r>
+        <w:rPr>
+          <w:rFonts w:hint="eastAsia"/>
+        </w:rPr>
+        <w:t>このファイルを読んで</w:t>
+      </w:r>
+    </w:p>
+    <w:p>
+      <w:pPr>
+        <w:rPr>
+          <w:rFonts w:hint="eastAsia"/>
+        </w:rPr>
+      </w:pPr>
+      <w:r>
+        <w:t>https://github.com/owner/repo/blob/main/path/to/file.ts</w:t>
+      </w:r>
+    </w:p>
+    <w:p>
+      <w:pPr>
+        <w:numPr>
+          <w:ilvl w:val="0"/>
+          <w:numId w:val="21"/>
+        </w:numPr>
+      </w:pPr>
+      <w:r>
+        <w:t>日本語版: </w:t>
+      </w:r>
+      <w:hyperlink r:id="rId5" w:tgtFrame="_blank" w:history="1">
+        <w:r>
+          <w:rPr>
+            <w:rStyle w:val="aa"/>
+          </w:rPr>
+          <w:t>docs/claw-implementation-roadmap.md</w:t>
+        </w:r>
+      </w:hyperlink>
+    </w:p>
+    <w:p>
+      <w:pPr>
+        <w:numPr>
+          <w:ilvl w:val="0"/>
+          <w:numId w:val="21"/>
+        </w:numPr>
+      </w:pPr>
+      <w:r>
+        <w:t>英語版: </w:t>
+      </w:r>
+      <w:hyperlink r:id="rId6" w:tgtFrame="_blank" w:history="1">
+        <w:r>
+          <w:rPr>
+            <w:rStyle w:val="aa"/>
+          </w:rPr>
+          <w:t>docs/claw-implementation-roadmap.en.md</w:t>
+        </w:r>
+      </w:hyperlink>
+    </w:p>
+    <w:p>
+      <w:pPr>
+        <w:rPr>
+          <w:rFonts w:hint="eastAsia"/>
+        </w:rPr>
+      </w:pPr>
+      <w:r>
+        <w:rPr>
+          <w:rFonts w:hint="eastAsia"/>
+        </w:rPr>
+        <w:t>※</w:t>
+      </w:r>
+      <w:r>
+        <w:rPr>
+          <w:rFonts w:hint="eastAsia"/>
+        </w:rPr>
+        <w:t>roadmapは</w:t>
+      </w:r>
+      <w:r>
+        <w:rPr>
+          <w:rFonts w:hint="eastAsia"/>
+        </w:rPr>
+        <w:t>spec同様</w:t>
+      </w:r>
+      <w:r>
+        <w:rPr>
+          <w:rFonts w:hint="eastAsia"/>
+        </w:rPr>
+        <w:t>、</w:t>
+      </w:r>
+      <w:r>
+        <w:rPr>
+          <w:rFonts w:eastAsia="ＭＳ Ｐゴシック"/>
+        </w:rPr>
+        <w:t>実装や設計の決定をする前に</w:t>
+      </w:r>
+      <w:r>
+        <w:rPr>
+          <w:rFonts w:eastAsia="ＭＳ Ｐゴシック" w:hint="eastAsia"/>
+        </w:rPr>
+        <w:t>確認、</w:t>
+      </w:r>
+      <w:r>
+        <w:rPr>
+          <w:rFonts w:eastAsia="ＭＳ Ｐゴシック"/>
+        </w:rPr>
+        <w:t>このチャットで仕様が変わる場合は、実装の前または同時に</w:t>
+      </w:r>
+      <w:r>
+        <w:rPr>
+          <w:rFonts w:eastAsia="ＭＳ Ｐゴシック" w:hint="eastAsia"/>
+        </w:rPr>
+        <w:t>更新</w:t>
+      </w:r>
+    </w:p>
+    <w:p>
+      <w:pPr>
+        <w:rPr>
+          <w:rFonts w:hint="eastAsia"/>
+        </w:rPr>
+      </w:pPr>
+    </w:p>
+    <w:p>
+      <w:r>
+        <w:rPr>
+          <w:rFonts w:hint="eastAsia"/>
+        </w:rPr>
+        <w:t>また、私は意志最終決定者　あなたはプロジェクト開発責任者として、追加実装の提案、ロードマップ、specにベースでの実装計画設計・最終レビューまで行ってください</w:t>
+      </w:r>
+    </w:p>
+    <w:p>
+      <w:r>
+        <w:rPr>
+          <w:rFonts w:hint="eastAsia"/>
+        </w:rPr>
+        <w:t>実装についてはcodex、GPT5.2、GPT5.4mini、GPT5.4　のうちタスク難易度やモデルにあったものを選択し、指示文の前に推奨モデルを明示してください</w:t>
+      </w:r>
+    </w:p>
+    <w:p>
+      <w:pPr>
+        <w:rPr>
+          <w:rFonts w:hint="eastAsia"/>
+        </w:rPr>
+      </w:pPr>
     </w:p>
     <w:p/>
     <w:p/>
     <w:p/>
+    <w:p/>
+    <w:p/>
+    <w:p/>
+    <w:p/>
     <w:p>
       <w:pPr>
         <w:rPr>
@@ -55,22 +317,66 @@
         </w:rPr>
       </w:pPr>
     </w:p>
-    <w:p>
-      <w:r>
-        <w:t xml:space="preserve">Read the latest committed `docs/claw-handover-spec.en.md` from `main` before making implementation or design decisions. If this chat changes the spec, update both `docs/claw-handover-spec.md` and `docs/claw-handover-spec.en.md` before or alongside implementation. Before finishing, </w:t>
-      </w:r>
-      <w:proofErr w:type="gramStart"/>
-      <w:r>
-        <w:t>reflect</w:t>
-      </w:r>
-      <w:proofErr w:type="gramEnd"/>
-      <w:r>
-        <w:t xml:space="preserve"> confirmed decisions, unresolved items, and the next entry point in both files, then treat them as the source of truth for the next chat.</w:t>
-      </w:r>
-    </w:p>
     <w:p/>
     <w:p>
       <w:r>
+        <w:rPr>
+          <w:rFonts w:eastAsia="ＭＳ Ｐゴシック"/>
+        </w:rPr>
+        <w:t>実装や設計の決定をする前に、最新のコミット済み「</w:t>
+      </w:r>
+      <w:r>
+        <w:rPr>
+          <w:rFonts w:eastAsia="ＭＳ Ｐゴシック"/>
+        </w:rPr>
+        <w:t>docs/claw-handover-spec.en.md</w:t>
+      </w:r>
+      <w:r>
+        <w:rPr>
+          <w:rFonts w:eastAsia="ＭＳ Ｐゴシック"/>
+        </w:rPr>
+        <w:t>」を「</w:t>
+      </w:r>
+      <w:r>
+        <w:rPr>
+          <w:rFonts w:eastAsia="ＭＳ Ｐゴシック"/>
+        </w:rPr>
+        <w:t>main</w:t>
+      </w:r>
+      <w:r>
+        <w:rPr>
+          <w:rFonts w:eastAsia="ＭＳ Ｐゴシック"/>
+        </w:rPr>
+        <w:t>」から読みましょう。このチャットで仕様が変わる場合は、実装の前または同時に「</w:t>
+      </w:r>
+      <w:r>
+        <w:rPr>
+          <w:rFonts w:eastAsia="ＭＳ Ｐゴシック"/>
+        </w:rPr>
+        <w:t>docs/claw-handover-spec.en.md</w:t>
+      </w:r>
+      <w:r>
+        <w:rPr>
+          <w:rFonts w:eastAsia="ＭＳ Ｐゴシック"/>
+        </w:rPr>
+        <w:t>」と「</w:t>
+      </w:r>
+      <w:r>
+        <w:rPr>
+          <w:rFonts w:eastAsia="ＭＳ Ｐゴシック"/>
+        </w:rPr>
+        <w:t>docs/claw-handover-spec.en.md</w:t>
+      </w:r>
+      <w:r>
+        <w:rPr>
+          <w:rFonts w:eastAsia="ＭＳ Ｐゴシック"/>
+        </w:rPr>
+        <w:t>」の両方を更新してください。終了前に、確認された決定、未解決の項目、次のエントリーポイントを両方のファイルに反映し、それらを次のチャットの真実の情報源として扱います。</w:t>
+      </w:r>
+    </w:p>
+    <w:p/>
+    <w:p>
+      <w:r>
         <w:t>K</w:t>
       </w:r>
       <w:r>
@@ -97,13 +403,64 @@
     <w:p/>
     <w:p>
       <w:r>
-        <w:t>Before making implementation or design decisions, read the latest committed docs/claw-handover-spec.en.md from main and follow it as source of truth. If your change requires a spec change, update both docs/claw-handover-spec.md and docs/claw-handover-spec.en.md in the same work unit.</w:t>
-      </w:r>
-    </w:p>
-    <w:p>
-      <w:r>
-        <w:pict w14:anchorId="2739B66D">
-          <v:rect id="_x0000_i1085" style="width:0;height:1.5pt" o:hralign="center" o:hrstd="t" o:hr="t" fillcolor="#a0a0a0" stroked="f">
+        <w:rPr>
+          <w:rFonts w:eastAsia="ＭＳ Ｐゴシック"/>
+        </w:rPr>
+        <w:t>実装や設計の決定をする前に、</w:t>
+      </w:r>
+      <w:r>
+        <w:rPr>
+          <w:rFonts w:eastAsia="ＭＳ Ｐゴシック"/>
+        </w:rPr>
+        <w:t>main</w:t>
+      </w:r>
+      <w:r>
+        <w:rPr>
+          <w:rFonts w:eastAsia="ＭＳ Ｐゴシック"/>
+        </w:rPr>
+        <w:t>の最新のコミット済みドキュメントや</w:t>
+      </w:r>
+      <w:r>
+        <w:rPr>
+          <w:rFonts w:eastAsia="ＭＳ Ｐゴシック"/>
+        </w:rPr>
+        <w:t>claw-handover-spec.en.md</w:t>
+      </w:r>
+      <w:r>
+        <w:rPr>
+          <w:rFonts w:eastAsia="ＭＳ Ｐゴシック"/>
+        </w:rPr>
+        <w:t>を読み、それを真実の情報源として従ってください。変更に仕様変更が必要な場合は、同じ作業ユニット内の</w:t>
+      </w:r>
+      <w:r>
+        <w:rPr>
+          <w:rFonts w:eastAsia="ＭＳ Ｐゴシック"/>
+        </w:rPr>
+        <w:t>docs/claw-handover-spec.md</w:t>
+      </w:r>
+      <w:r>
+        <w:rPr>
+          <w:rFonts w:eastAsia="ＭＳ Ｐゴシック"/>
+        </w:rPr>
+        <w:t>と</w:t>
+      </w:r>
+      <w:r>
+        <w:rPr>
+          <w:rFonts w:eastAsia="ＭＳ Ｐゴシック"/>
+        </w:rPr>
+        <w:t>docs/claw-handover-spec.en.md</w:t>
+      </w:r>
+      <w:r>
+        <w:rPr>
+          <w:rFonts w:eastAsia="ＭＳ Ｐゴシック"/>
+        </w:rPr>
+        <w:t>の両方を更新してください。</w:t>
+      </w:r>
+    </w:p>
+    <w:p>
+      <w:r>
+        <w:pict w14:anchorId="58F8767F">
+          <v:rect id="_x0000_i1045" style="width:0;height:1.5pt" o:hralign="center" o:hrstd="t" o:hr="t" fillcolor="#a0a0a0" stroked="f">
             <v:textbox inset="5.85pt,.7pt,5.85pt,.7pt"/>
           </v:rect>
         </w:pict>
@@ -118,31 +475,57 @@
       </w:pPr>
       <w:r>
         <w:rPr>
+          <w:rFonts w:eastAsia="SimSun"/>
           <w:b/>
           <w:bCs/>
         </w:rPr>
-        <w:t>Task</w:t>
-      </w:r>
-    </w:p>
-    <w:p>
-      <w:r>
-        <w:t xml:space="preserve">Harden Project Memory v3 assistant-suggested candidates in apps/claw-studio by adding </w:t>
-      </w:r>
-      <w:r>
-        <w:rPr>
+        <w:t>任務</w:t>
+      </w:r>
+    </w:p>
+    <w:p>
+      <w:r>
+        <w:rPr>
+          <w:rFonts w:eastAsia="ＭＳ Ｐゴシック"/>
+        </w:rPr>
+        <w:t>Harden Project Memory v3</w:t>
+      </w:r>
+      <w:r>
+        <w:rPr>
+          <w:rFonts w:eastAsia="ＭＳ Ｐゴシック"/>
+        </w:rPr>
+        <w:t>アシスタントは、正規化重複抑制を追加することでアプリや</w:t>
+      </w:r>
+      <w:r>
+        <w:rPr>
+          <w:rFonts w:eastAsia="ＭＳ Ｐゴシック"/>
+        </w:rPr>
+        <w:t>claw-studio</w:t>
+      </w:r>
+      <w:r>
+        <w:rPr>
+          <w:rFonts w:eastAsia="ＭＳ Ｐゴシック"/>
+        </w:rPr>
+        <w:t>で候補を提案</w:t>
+      </w:r>
+      <w:r>
+        <w:rPr>
+          <w:rFonts w:eastAsia="ＭＳ Ｐゴシック"/>
           <w:b/>
           <w:bCs/>
         </w:rPr>
-        <w:t>normalized duplicate suppression</w:t>
-      </w:r>
-      <w:r>
-        <w:t>, without changing the promotion boundary or store architecture.</w:t>
-      </w:r>
-    </w:p>
-    <w:p>
-      <w:r>
-        <w:pict w14:anchorId="6C182F17">
-          <v:rect id="_x0000_i1086" style="width:0;height:1.5pt" o:hralign="center" o:hrstd="t" o:hr="t" fillcolor="#a0a0a0" stroked="f">
+        <w:t>し</w:t>
+      </w:r>
+      <w:r>
+        <w:rPr>
+          <w:rFonts w:eastAsia="ＭＳ Ｐゴシック"/>
+        </w:rPr>
+        <w:t>、プロモーション境界やストアアーキテクチャは変更せずに提供しました。</w:t>
+      </w:r>
+    </w:p>
+    <w:p>
+      <w:r>
+        <w:pict w14:anchorId="4EE6BB2E">
+          <v:rect id="_x0000_i1046" style="width:0;height:1.5pt" o:hralign="center" o:hrstd="t" o:hr="t" fillcolor="#a0a0a0" stroked="f">
             <v:textbox inset="5.85pt,.7pt,5.85pt,.7pt"/>
           </v:rect>
         </w:pict>
@@ -157,133 +540,249 @@
       </w:pPr>
       <w:r>
         <w:rPr>
+          <w:rFonts w:eastAsia="ＭＳ Ｐゴシック"/>
           <w:b/>
           <w:bCs/>
         </w:rPr>
-        <w:lastRenderedPageBreak/>
-        <w:t>Non-Negotiable Constraints (MUST FOLLOW)</w:t>
-      </w:r>
-    </w:p>
-    <w:p>
-      <w:r>
-        <w:t>You MUST NOT:</w:t>
+        <w:t>交渉不能制約</w:t>
+      </w:r>
+      <w:r>
+        <w:rPr>
+          <w:rFonts w:eastAsia="ＭＳ Ｐゴシック"/>
+          <w:b/>
+          <w:bCs/>
+        </w:rPr>
+        <w:t>(</w:t>
+      </w:r>
+      <w:r>
+        <w:rPr>
+          <w:rFonts w:eastAsia="ＭＳ Ｐゴシック"/>
+          <w:b/>
+          <w:bCs/>
+        </w:rPr>
+        <w:t>必ず従うべき</w:t>
+      </w:r>
+      <w:r>
+        <w:rPr>
+          <w:rFonts w:eastAsia="ＭＳ Ｐゴシック"/>
+          <w:b/>
+          <w:bCs/>
+        </w:rPr>
+        <w:t>)</w:t>
+      </w:r>
+    </w:p>
+    <w:p>
+      <w:r>
+        <w:rPr>
+          <w:rFonts w:eastAsia="ＭＳ Ｐゴシック"/>
+        </w:rPr>
+        <w:t>絶対にしてはいけません</w:t>
+      </w:r>
+      <w:r>
+        <w:rPr>
+          <w:rFonts w:eastAsia="ＭＳ Ｐゴシック"/>
+        </w:rPr>
+        <w:t>:</w:t>
       </w:r>
     </w:p>
     <w:p>
       <w:pPr>
         <w:numPr>
           <w:ilvl w:val="0"/>
-          <w:numId w:val="1"/>
+          <w:numId w:val="11"/>
         </w:numPr>
       </w:pPr>
       <w:r>
-        <w:t>refactor or restructure existing store logic</w:t>
+        <w:rPr>
+          <w:rFonts w:eastAsia="ＭＳ Ｐゴシック"/>
+        </w:rPr>
+        <w:t>既存のストアロジックをリファクタリングまたは再構築</w:t>
       </w:r>
     </w:p>
     <w:p>
       <w:pPr>
         <w:numPr>
           <w:ilvl w:val="0"/>
-          <w:numId w:val="1"/>
+          <w:numId w:val="11"/>
         </w:numPr>
       </w:pPr>
       <w:r>
-        <w:t>change suggestion → pending → accept flow</w:t>
+        <w:rPr>
+          <w:rFonts w:eastAsia="ＭＳ Ｐゴシック"/>
+        </w:rPr>
+        <w:t>変更提案</w:t>
+      </w:r>
+      <w:r>
+        <w:rPr>
+          <w:rFonts w:eastAsia="ＭＳ Ｐゴシック"/>
+        </w:rPr>
+        <w:t>→</w:t>
+      </w:r>
+      <w:r>
+        <w:rPr>
+          <w:rFonts w:eastAsia="ＭＳ Ｐゴシック"/>
+        </w:rPr>
+        <w:t>保留中</w:t>
+      </w:r>
+      <w:r>
+        <w:rPr>
+          <w:rFonts w:eastAsia="ＭＳ Ｐゴシック"/>
+        </w:rPr>
+        <w:t xml:space="preserve"> → </w:t>
+      </w:r>
+      <w:r>
+        <w:rPr>
+          <w:rFonts w:eastAsia="ＭＳ Ｐゴシック"/>
+        </w:rPr>
+        <w:t>フローを受け入れてください</w:t>
       </w:r>
     </w:p>
     <w:p>
       <w:pPr>
         <w:numPr>
           <w:ilvl w:val="0"/>
-          <w:numId w:val="1"/>
+          <w:numId w:val="11"/>
         </w:numPr>
       </w:pPr>
       <w:r>
-        <w:t>auto-promote suggestions into pending or durable</w:t>
+        <w:rPr>
+          <w:rFonts w:eastAsia="ＭＳ Ｐゴシック"/>
+        </w:rPr>
+        <w:t>提案を保留中または持続的に自動昇格する</w:t>
       </w:r>
     </w:p>
     <w:p>
       <w:pPr>
         <w:numPr>
           <w:ilvl w:val="0"/>
-          <w:numId w:val="1"/>
+          <w:numId w:val="11"/>
         </w:numPr>
       </w:pPr>
       <w:r>
-        <w:t>mutate durable memory except on explicit accept</w:t>
+        <w:rPr>
+          <w:rFonts w:eastAsia="ＭＳ Ｐゴシック"/>
+        </w:rPr>
+        <w:t>明示的に受け入れない限り、持続記憶を変異させる</w:t>
       </w:r>
     </w:p>
     <w:p>
       <w:pPr>
         <w:numPr>
           <w:ilvl w:val="0"/>
-          <w:numId w:val="1"/>
+          <w:numId w:val="11"/>
         </w:numPr>
       </w:pPr>
       <w:r>
-        <w:t>add new persistence fields or expand persistence scope</w:t>
+        <w:rPr>
+          <w:rFonts w:eastAsia="ＭＳ Ｐゴシック"/>
+        </w:rPr>
+        <w:t>新しい永続性フィールドの追加または永続性範囲の拡大</w:t>
       </w:r>
     </w:p>
     <w:p>
       <w:pPr>
         <w:numPr>
           <w:ilvl w:val="0"/>
-          <w:numId w:val="1"/>
+          <w:numId w:val="11"/>
         </w:numPr>
       </w:pPr>
       <w:r>
-        <w:t>modify run/state ownership boundaries (local-</w:t>
-      </w:r>
-      <w:proofErr w:type="spellStart"/>
-      <w:r>
-        <w:t>api</w:t>
-      </w:r>
-      <w:proofErr w:type="spellEnd"/>
-      <w:r>
-        <w:t xml:space="preserve"> remains the only state owner)</w:t>
+        <w:rPr>
+          <w:rFonts w:eastAsia="ＭＳ Ｐゴシック"/>
+        </w:rPr>
+        <w:t>ラン</w:t>
+      </w:r>
+      <w:r>
+        <w:rPr>
+          <w:rFonts w:eastAsia="ＭＳ Ｐゴシック"/>
+        </w:rPr>
+        <w:t>/</w:t>
+      </w:r>
+      <w:r>
+        <w:rPr>
+          <w:rFonts w:eastAsia="ＭＳ Ｐゴシック"/>
+        </w:rPr>
+        <w:t>州所有権の境界を変更する</w:t>
+      </w:r>
+      <w:r>
+        <w:rPr>
+          <w:rFonts w:eastAsia="ＭＳ Ｐゴシック"/>
+        </w:rPr>
+        <w:t>(local-API</w:t>
+      </w:r>
+      <w:r>
+        <w:rPr>
+          <w:rFonts w:eastAsia="ＭＳ Ｐゴシック"/>
+        </w:rPr>
+        <w:t>が唯一の州所有者のまま</w:t>
+      </w:r>
+      <w:r>
+        <w:rPr>
+          <w:rFonts w:eastAsia="ＭＳ Ｐゴシック"/>
+        </w:rPr>
+        <w:t>)</w:t>
       </w:r>
     </w:p>
     <w:p>
       <w:pPr>
         <w:numPr>
           <w:ilvl w:val="0"/>
-          <w:numId w:val="1"/>
+          <w:numId w:val="11"/>
         </w:numPr>
       </w:pPr>
       <w:r>
-        <w:t>redesign UI, overlay, or introduce a new suggestion panel</w:t>
+        <w:rPr>
+          <w:rFonts w:eastAsia="ＭＳ Ｐゴシック"/>
+        </w:rPr>
+        <w:t>UI</w:t>
+      </w:r>
+      <w:r>
+        <w:rPr>
+          <w:rFonts w:eastAsia="ＭＳ Ｐゴシック"/>
+        </w:rPr>
+        <w:t>のリデザイン、オーバーレイ、または新しい提案パネルの導入</w:t>
       </w:r>
     </w:p>
     <w:p>
       <w:pPr>
         <w:numPr>
           <w:ilvl w:val="0"/>
-          <w:numId w:val="1"/>
+          <w:numId w:val="11"/>
         </w:numPr>
       </w:pPr>
       <w:r>
-        <w:t>introduce fuzzy matching or semantic similarity logic</w:t>
-      </w:r>
-    </w:p>
-    <w:p>
-      <w:r>
-        <w:t xml:space="preserve">This task is </w:t>
-      </w:r>
-      <w:r>
-        <w:rPr>
+        <w:rPr>
+          <w:rFonts w:eastAsia="ＭＳ Ｐゴシック"/>
+        </w:rPr>
+        <w:t>ファジィマッチングや意味的類似性論理を導入します</w:t>
+      </w:r>
+    </w:p>
+    <w:p>
+      <w:r>
+        <w:rPr>
+          <w:rFonts w:eastAsia="ＭＳ Ｐゴシック"/>
+        </w:rPr>
+        <w:t>この作業は</w:t>
+      </w:r>
+      <w:r>
+        <w:rPr>
+          <w:rFonts w:eastAsia="ＭＳ Ｐゴシック"/>
           <w:b/>
           <w:bCs/>
         </w:rPr>
-        <w:t>strictly a minimal, local improvement</w:t>
-      </w:r>
-      <w:r>
-        <w:t>.</w:t>
-      </w:r>
-    </w:p>
-    <w:p>
-      <w:r>
-        <w:pict w14:anchorId="76D367BC">
-          <v:rect id="_x0000_i1087" style="width:0;height:1.5pt" o:hralign="center" o:hrstd="t" o:hr="t" fillcolor="#a0a0a0" stroked="f">
+        <w:t>あくまで最小限の局所的な改善に過ぎ</w:t>
+      </w:r>
+      <w:r>
+        <w:rPr>
+          <w:rFonts w:eastAsia="ＭＳ Ｐゴシック"/>
+        </w:rPr>
+        <w:t>ません。</w:t>
+      </w:r>
+    </w:p>
+    <w:p>
+      <w:r>
+        <w:pict w14:anchorId="04A7B3C6">
+          <v:rect id="_x0000_i1047" style="width:0;height:1.5pt" o:hralign="center" o:hrstd="t" o:hr="t" fillcolor="#a0a0a0" stroked="f">
             <v:textbox inset="5.85pt,.7pt,5.85pt,.7pt"/>
           </v:rect>
         </w:pict>
@@ -298,17 +797,18 @@
       </w:pPr>
       <w:r>
         <w:rPr>
+          <w:rFonts w:eastAsia="ＭＳ Ｐゴシック"/>
           <w:b/>
           <w:bCs/>
         </w:rPr>
-        <w:t>Primary Target</w:t>
+        <w:t>主なターゲット</w:t>
       </w:r>
     </w:p>
     <w:p>
       <w:pPr>
         <w:numPr>
           <w:ilvl w:val="0"/>
-          <w:numId w:val="2"/>
+          <w:numId w:val="12"/>
         </w:numPr>
       </w:pPr>
       <w:r>
@@ -330,21 +830,16 @@
     </w:p>
     <w:p>
       <w:r>
-        <w:t xml:space="preserve">Only touch other files if </w:t>
-      </w:r>
-      <w:proofErr w:type="gramStart"/>
-      <w:r>
-        <w:t>absolutely necessary</w:t>
-      </w:r>
-      <w:proofErr w:type="gramEnd"/>
-      <w:r>
-        <w:t>.</w:t>
-      </w:r>
-    </w:p>
-    <w:p>
-      <w:r>
-        <w:pict w14:anchorId="273F842B">
-          <v:rect id="_x0000_i1088" style="width:0;height:1.5pt" o:hralign="center" o:hrstd="t" o:hr="t" fillcolor="#a0a0a0" stroked="f">
+        <w:rPr>
+          <w:rFonts w:eastAsia="ＭＳ Ｐゴシック"/>
+        </w:rPr>
+        <w:t>絶対に必要な場合のみ他のファイルには触れてください。</w:t>
+      </w:r>
+    </w:p>
+    <w:p>
+      <w:r>
+        <w:pict w14:anchorId="30A86129">
+          <v:rect id="_x0000_i1048" style="width:0;height:1.5pt" o:hralign="center" o:hrstd="t" o:hr="t" fillcolor="#a0a0a0" stroked="f">
             <v:textbox inset="5.85pt,.7pt,5.85pt,.7pt"/>
           </v:rect>
         </w:pict>
@@ -359,10 +854,12 @@
       </w:pPr>
       <w:r>
         <w:rPr>
+          <w:rFonts w:eastAsia="SimSun"/>
           <w:b/>
           <w:bCs/>
         </w:rPr>
-        <w:t>Implementation Requirements</w:t>
+        <w:lastRenderedPageBreak/>
+        <w:t>実装要件</w:t>
       </w:r>
     </w:p>
     <w:p>
@@ -374,141 +871,251 @@
       </w:pPr>
       <w:r>
         <w:rPr>
+          <w:rFonts w:eastAsia="ＭＳ Ｐゴシック"/>
           <w:b/>
           <w:bCs/>
         </w:rPr>
-        <w:t>1. Add normalization helper</w:t>
-      </w:r>
-    </w:p>
-    <w:p>
-      <w:r>
-        <w:t>Create a small helper for comparison:</w:t>
+        <w:t xml:space="preserve">1. </w:t>
+      </w:r>
+      <w:r>
+        <w:rPr>
+          <w:rFonts w:eastAsia="ＭＳ Ｐゴシック"/>
+          <w:b/>
+          <w:bCs/>
+        </w:rPr>
+        <w:t>正規化ヘルパーの追加</w:t>
+      </w:r>
+    </w:p>
+    <w:p>
+      <w:r>
+        <w:rPr>
+          <w:rFonts w:eastAsia="ＭＳ Ｐゴシック"/>
+        </w:rPr>
+        <w:t>比較用の小さな補助者を作成しましょう</w:t>
+      </w:r>
+      <w:r>
+        <w:rPr>
+          <w:rFonts w:eastAsia="ＭＳ Ｐゴシック"/>
+        </w:rPr>
+        <w:t>:</w:t>
       </w:r>
     </w:p>
     <w:p>
       <w:pPr>
         <w:numPr>
           <w:ilvl w:val="0"/>
-          <w:numId w:val="3"/>
+          <w:numId w:val="13"/>
         </w:numPr>
       </w:pPr>
       <w:r>
-        <w:t>trim</w:t>
+        <w:rPr>
+          <w:rFonts w:eastAsia="ＭＳ Ｐゴシック"/>
+        </w:rPr>
+        <w:t>トリム</w:t>
       </w:r>
     </w:p>
     <w:p>
       <w:pPr>
         <w:numPr>
           <w:ilvl w:val="0"/>
-          <w:numId w:val="3"/>
+          <w:numId w:val="13"/>
         </w:numPr>
       </w:pPr>
       <w:r>
-        <w:t>lowercase</w:t>
+        <w:rPr>
+          <w:rFonts w:eastAsia="SimSun"/>
+        </w:rPr>
+        <w:t>小文字</w:t>
       </w:r>
     </w:p>
     <w:p>
       <w:pPr>
         <w:numPr>
           <w:ilvl w:val="0"/>
-          <w:numId w:val="3"/>
+          <w:numId w:val="13"/>
         </w:numPr>
       </w:pPr>
       <w:r>
-        <w:t>collapse whitespace</w:t>
+        <w:rPr>
+          <w:rFonts w:eastAsia="ＭＳ Ｐゴシック"/>
+        </w:rPr>
+        <w:t>圧縮ホワイトスペース</w:t>
       </w:r>
     </w:p>
     <w:p>
       <w:pPr>
         <w:numPr>
           <w:ilvl w:val="0"/>
-          <w:numId w:val="3"/>
+          <w:numId w:val="13"/>
         </w:numPr>
       </w:pPr>
       <w:r>
-        <w:t xml:space="preserve">remove leading bullet markers (-, </w:t>
-      </w:r>
-      <w:proofErr w:type="gramStart"/>
-      <w:r>
-        <w:t>*, •</w:t>
-      </w:r>
-      <w:proofErr w:type="gramEnd"/>
-      <w:r>
-        <w:t>)</w:t>
+        <w:rPr>
+          <w:rFonts w:eastAsia="ＭＳ Ｐゴシック"/>
+        </w:rPr>
+        <w:t>先頭の弾丸マーカー</w:t>
+      </w:r>
+      <w:r>
+        <w:rPr>
+          <w:rFonts w:eastAsia="ＭＳ Ｐゴシック"/>
+        </w:rPr>
+        <w:t>(-, *, •)</w:t>
+      </w:r>
+      <w:r>
+        <w:rPr>
+          <w:rFonts w:eastAsia="ＭＳ Ｐゴシック"/>
+        </w:rPr>
+        <w:t>を削除します</w:t>
       </w:r>
     </w:p>
     <w:p>
       <w:pPr>
         <w:numPr>
           <w:ilvl w:val="0"/>
-          <w:numId w:val="3"/>
+          <w:numId w:val="13"/>
         </w:numPr>
       </w:pPr>
       <w:r>
-        <w:t>remove trailing punctuation (</w:t>
-      </w:r>
-      <w:proofErr w:type="gramStart"/>
-      <w:r>
-        <w:t>. !</w:t>
-      </w:r>
-      <w:proofErr w:type="gramEnd"/>
-      <w:r>
-        <w:t xml:space="preserve"> ? 。 ．)</w:t>
+        <w:rPr>
+          <w:rFonts w:eastAsia="ＭＳ Ｐゴシック"/>
+        </w:rPr>
+        <w:t>後続の句読点</w:t>
+      </w:r>
+      <w:r>
+        <w:rPr>
+          <w:rFonts w:eastAsia="ＭＳ Ｐゴシック"/>
+        </w:rPr>
+        <w:t xml:space="preserve">(. ! ? </w:t>
+      </w:r>
+      <w:r>
+        <w:rPr>
+          <w:rFonts w:eastAsia="ＭＳ Ｐゴシック"/>
+        </w:rPr>
+        <w:t>。．</w:t>
+      </w:r>
+      <w:r>
+        <w:rPr>
+          <w:rFonts w:eastAsia="ＭＳ Ｐゴシック"/>
+        </w:rPr>
+        <w:t>)</w:t>
       </w:r>
     </w:p>
     <w:p>
       <w:pPr>
         <w:numPr>
           <w:ilvl w:val="0"/>
-          <w:numId w:val="3"/>
+          <w:numId w:val="13"/>
         </w:numPr>
       </w:pPr>
       <w:r>
-        <w:t>optionally strip simple prefixes like:</w:t>
+        <w:rPr>
+          <w:rFonts w:eastAsia="ＭＳ Ｐゴシック"/>
+        </w:rPr>
+        <w:t>オプションで、以下のような単純な接頭辞を外すこともできます</w:t>
+      </w:r>
+      <w:r>
+        <w:rPr>
+          <w:rFonts w:eastAsia="ＭＳ Ｐゴシック"/>
+        </w:rPr>
+        <w:t>:</w:t>
       </w:r>
     </w:p>
     <w:p>
       <w:pPr>
         <w:numPr>
           <w:ilvl w:val="1"/>
-          <w:numId w:val="3"/>
+          <w:numId w:val="13"/>
         </w:numPr>
       </w:pPr>
       <w:r>
-        <w:t>Decision:</w:t>
+        <w:rPr>
+          <w:rFonts w:eastAsia="SimSun"/>
+        </w:rPr>
+        <w:t>判決</w:t>
+      </w:r>
+      <w:r>
+        <w:rPr>
+          <w:rFonts w:eastAsia="SimSun"/>
+        </w:rPr>
+        <w:t>:</w:t>
       </w:r>
     </w:p>
     <w:p>
       <w:pPr>
         <w:numPr>
           <w:ilvl w:val="1"/>
-          <w:numId w:val="3"/>
+          <w:numId w:val="13"/>
         </w:numPr>
       </w:pPr>
       <w:r>
-        <w:t>Rule:</w:t>
+        <w:rPr>
+          <w:rFonts w:eastAsia="ＭＳ Ｐゴシック"/>
+        </w:rPr>
+        <w:t>ルール</w:t>
+      </w:r>
+      <w:r>
+        <w:rPr>
+          <w:rFonts w:eastAsia="ＭＳ Ｐゴシック"/>
+        </w:rPr>
+        <w:t>:</w:t>
       </w:r>
     </w:p>
     <w:p>
       <w:pPr>
         <w:numPr>
           <w:ilvl w:val="1"/>
-          <w:numId w:val="3"/>
+          <w:numId w:val="13"/>
         </w:numPr>
       </w:pPr>
       <w:r>
-        <w:t>Next:</w:t>
-      </w:r>
-    </w:p>
-    <w:p>
-      <w:r>
-        <w:t>⚠️ Do NOT over-normalize (keep it simple and safe)</w:t>
-      </w:r>
-    </w:p>
-    <w:p>
-      <w:r>
-        <w:pict w14:anchorId="4ABE3C9D">
-          <v:rect id="_x0000_i1089" style="width:0;height:1.5pt" o:hralign="center" o:hrstd="t" o:hr="t" fillcolor="#a0a0a0" stroked="f">
+        <w:rPr>
+          <w:rFonts w:eastAsia="SimSun"/>
+        </w:rPr>
+        <w:t>次回</w:t>
+      </w:r>
+      <w:r>
+        <w:rPr>
+          <w:rFonts w:eastAsia="SimSun"/>
+        </w:rPr>
+        <w:t>:</w:t>
+      </w:r>
+    </w:p>
+    <w:p>
+      <w:r>
+        <w:rPr>
+          <w:rFonts w:eastAsia="ＭＳ Ｐゴシック"/>
+        </w:rPr>
+        <w:t xml:space="preserve">⚠️ </w:t>
+      </w:r>
+      <w:r>
+        <w:rPr>
+          <w:rFonts w:eastAsia="ＭＳ Ｐゴシック"/>
+        </w:rPr>
+        <w:t>過度に普通化しないでください</w:t>
+      </w:r>
+      <w:r>
+        <w:rPr>
+          <w:rFonts w:eastAsia="ＭＳ Ｐゴシック"/>
+        </w:rPr>
+        <w:t>(</w:t>
+      </w:r>
+      <w:r>
+        <w:rPr>
+          <w:rFonts w:eastAsia="ＭＳ Ｐゴシック"/>
+        </w:rPr>
+        <w:t>シンプルで安全に保ちましょう</w:t>
+      </w:r>
+      <w:r>
+        <w:rPr>
+          <w:rFonts w:eastAsia="ＭＳ Ｐゴシック"/>
+        </w:rPr>
+        <w:t>)</w:t>
+      </w:r>
+    </w:p>
+    <w:p>
+      <w:r>
+        <w:pict w14:anchorId="46A43E81">
+          <v:rect id="_x0000_i1049" style="width:0;height:1.5pt" o:hralign="center" o:hrstd="t" o:hr="t" fillcolor="#a0a0a0" stroked="f">
             <v:textbox inset="5.85pt,.7pt,5.85pt,.7pt"/>
           </v:rect>
         </w:pict>
@@ -523,54 +1130,81 @@
       </w:pPr>
       <w:r>
         <w:rPr>
+          <w:rFonts w:eastAsia="ＭＳ Ｐゴシック"/>
           <w:b/>
           <w:bCs/>
         </w:rPr>
-        <w:t>2. Build existing candidate key set</w:t>
-      </w:r>
-    </w:p>
-    <w:p>
-      <w:r>
-        <w:t>Before inserting suggestions, collect normalized keys from:</w:t>
+        <w:t xml:space="preserve">2. </w:t>
+      </w:r>
+      <w:r>
+        <w:rPr>
+          <w:rFonts w:eastAsia="ＭＳ Ｐゴシック"/>
+          <w:b/>
+          <w:bCs/>
+        </w:rPr>
+        <w:t>既存の候補キーセットを構築する</w:t>
+      </w:r>
+    </w:p>
+    <w:p>
+      <w:r>
+        <w:rPr>
+          <w:rFonts w:eastAsia="ＭＳ Ｐゴシック"/>
+        </w:rPr>
+        <w:t>提案を挿入する前に、以下から正規化された鍵を集めてください</w:t>
+      </w:r>
+      <w:r>
+        <w:rPr>
+          <w:rFonts w:eastAsia="ＭＳ Ｐゴシック"/>
+        </w:rPr>
+        <w:t>:</w:t>
       </w:r>
     </w:p>
     <w:p>
       <w:pPr>
         <w:numPr>
           <w:ilvl w:val="0"/>
-          <w:numId w:val="4"/>
+          <w:numId w:val="14"/>
         </w:numPr>
       </w:pPr>
       <w:r>
-        <w:t>durable memory</w:t>
+        <w:rPr>
+          <w:rFonts w:eastAsia="ＭＳ Ｐゴシック"/>
+        </w:rPr>
+        <w:t>耐久性のある記憶</w:t>
       </w:r>
     </w:p>
     <w:p>
       <w:pPr>
         <w:numPr>
           <w:ilvl w:val="0"/>
-          <w:numId w:val="4"/>
+          <w:numId w:val="14"/>
         </w:numPr>
       </w:pPr>
       <w:r>
-        <w:t>pending review items</w:t>
+        <w:rPr>
+          <w:rFonts w:eastAsia="SimSun"/>
+        </w:rPr>
+        <w:t>審査保留項目</w:t>
       </w:r>
     </w:p>
     <w:p>
       <w:pPr>
         <w:numPr>
           <w:ilvl w:val="0"/>
-          <w:numId w:val="4"/>
+          <w:numId w:val="14"/>
         </w:numPr>
       </w:pPr>
       <w:r>
-        <w:t>existing suggestions in current session</w:t>
-      </w:r>
-    </w:p>
-    <w:p>
-      <w:r>
-        <w:pict w14:anchorId="7F282873">
-          <v:rect id="_x0000_i1090" style="width:0;height:1.5pt" o:hralign="center" o:hrstd="t" o:hr="t" fillcolor="#a0a0a0" stroked="f">
+        <w:rPr>
+          <w:rFonts w:eastAsia="ＭＳ Ｐゴシック"/>
+        </w:rPr>
+        <w:t>現在の会期における既存の提案</w:t>
+      </w:r>
+    </w:p>
+    <w:p>
+      <w:r>
+        <w:pict w14:anchorId="25FEC830">
+          <v:rect id="_x0000_i1050" style="width:0;height:1.5pt" o:hralign="center" o:hrstd="t" o:hr="t" fillcolor="#a0a0a0" stroked="f">
             <v:textbox inset="5.85pt,.7pt,5.85pt,.7pt"/>
           </v:rect>
         </w:pict>
@@ -585,82 +1219,123 @@
       </w:pPr>
       <w:r>
         <w:rPr>
+          <w:rFonts w:eastAsia="ＭＳ Ｐゴシック"/>
           <w:b/>
           <w:bCs/>
         </w:rPr>
-        <w:lastRenderedPageBreak/>
-        <w:t>3. Filter new candidates</w:t>
-      </w:r>
-    </w:p>
-    <w:p>
-      <w:r>
-        <w:t>When heuristic produces candidates:</w:t>
+        <w:t xml:space="preserve">3. </w:t>
+      </w:r>
+      <w:r>
+        <w:rPr>
+          <w:rFonts w:eastAsia="ＭＳ Ｐゴシック"/>
+          <w:b/>
+          <w:bCs/>
+        </w:rPr>
+        <w:t>新しい候補者を絞り込む</w:t>
+      </w:r>
+    </w:p>
+    <w:p>
+      <w:r>
+        <w:rPr>
+          <w:rFonts w:eastAsia="ＭＳ Ｐゴシック"/>
+        </w:rPr>
+        <w:t>ヒューリスティックが候補を生成する場合</w:t>
+      </w:r>
+      <w:r>
+        <w:rPr>
+          <w:rFonts w:eastAsia="ＭＳ Ｐゴシック"/>
+        </w:rPr>
+        <w:t>:</w:t>
       </w:r>
     </w:p>
     <w:p>
       <w:pPr>
         <w:numPr>
           <w:ilvl w:val="0"/>
-          <w:numId w:val="5"/>
+          <w:numId w:val="15"/>
         </w:numPr>
       </w:pPr>
       <w:r>
-        <w:t>normalize each candidate</w:t>
+        <w:rPr>
+          <w:rFonts w:eastAsia="ＭＳ Ｐゴシック"/>
+        </w:rPr>
+        <w:t>各候補者を正規化する</w:t>
       </w:r>
     </w:p>
     <w:p>
       <w:pPr>
         <w:numPr>
           <w:ilvl w:val="0"/>
-          <w:numId w:val="5"/>
+          <w:numId w:val="15"/>
         </w:numPr>
       </w:pPr>
       <w:r>
-        <w:t>skip empty or very short results</w:t>
+        <w:rPr>
+          <w:rFonts w:eastAsia="ＭＳ Ｐゴシック"/>
+        </w:rPr>
+        <w:t>空または非常に短い結果をスキップしてください</w:t>
       </w:r>
     </w:p>
     <w:p>
       <w:pPr>
         <w:numPr>
           <w:ilvl w:val="0"/>
-          <w:numId w:val="5"/>
+          <w:numId w:val="15"/>
         </w:numPr>
       </w:pPr>
       <w:r>
-        <w:t>skip if already exists in key set</w:t>
+        <w:rPr>
+          <w:rFonts w:eastAsia="ＭＳ Ｐゴシック"/>
+        </w:rPr>
+        <w:t>キーセットにすでに存在する場合はスキップ</w:t>
       </w:r>
     </w:p>
     <w:p>
       <w:pPr>
         <w:numPr>
           <w:ilvl w:val="0"/>
-          <w:numId w:val="5"/>
+          <w:numId w:val="15"/>
         </w:numPr>
       </w:pPr>
       <w:r>
-        <w:t>also dedupe within the same batch</w:t>
-      </w:r>
-    </w:p>
-    <w:p>
-      <w:r>
-        <w:t>Result:</w:t>
+        <w:rPr>
+          <w:rFonts w:eastAsia="ＭＳ Ｐゴシック"/>
+        </w:rPr>
+        <w:t>同じバッチ内での重複除去も行います</w:t>
+      </w:r>
+    </w:p>
+    <w:p>
+      <w:r>
+        <w:rPr>
+          <w:rFonts w:eastAsia="SimSun"/>
+        </w:rPr>
+        <w:t>結果</w:t>
+      </w:r>
+      <w:r>
+        <w:rPr>
+          <w:rFonts w:eastAsia="SimSun"/>
+        </w:rPr>
+        <w:t>:</w:t>
       </w:r>
     </w:p>
     <w:p>
       <w:pPr>
         <w:numPr>
           <w:ilvl w:val="0"/>
-          <w:numId w:val="6"/>
+          <w:numId w:val="16"/>
         </w:numPr>
       </w:pPr>
       <w:r>
-        <w:t>only unique candidates are added as suggestion rows</w:t>
-      </w:r>
-    </w:p>
-    <w:p>
-      <w:r>
-        <w:pict w14:anchorId="42A4C6AD">
-          <v:rect id="_x0000_i1091" style="width:0;height:1.5pt" o:hralign="center" o:hrstd="t" o:hr="t" fillcolor="#a0a0a0" stroked="f">
+        <w:rPr>
+          <w:rFonts w:eastAsia="ＭＳ Ｐゴシック"/>
+        </w:rPr>
+        <w:t>提案行として追加されるのは一意候補のみです</w:t>
+      </w:r>
+    </w:p>
+    <w:p>
+      <w:r>
+        <w:pict w14:anchorId="3A528D70">
+          <v:rect id="_x0000_i1051" style="width:0;height:1.5pt" o:hralign="center" o:hrstd="t" o:hr="t" fillcolor="#a0a0a0" stroked="f">
             <v:textbox inset="5.85pt,.7pt,5.85pt,.7pt"/>
           </v:rect>
         </w:pict>
@@ -675,57 +1350,91 @@
       </w:pPr>
       <w:r>
         <w:rPr>
+          <w:rFonts w:eastAsia="ＭＳ Ｐゴシック"/>
           <w:b/>
           <w:bCs/>
         </w:rPr>
-        <w:t>4. Preserve semantics</w:t>
+        <w:t xml:space="preserve">4. </w:t>
+      </w:r>
+      <w:r>
+        <w:rPr>
+          <w:rFonts w:eastAsia="ＭＳ Ｐゴシック"/>
+          <w:b/>
+          <w:bCs/>
+        </w:rPr>
+        <w:t>意味論の保持</w:t>
       </w:r>
     </w:p>
     <w:p>
       <w:pPr>
         <w:numPr>
           <w:ilvl w:val="0"/>
-          <w:numId w:val="7"/>
+          <w:numId w:val="17"/>
         </w:numPr>
       </w:pPr>
       <w:r>
-        <w:t xml:space="preserve">keep </w:t>
-      </w:r>
-      <w:proofErr w:type="spellStart"/>
-      <w:r>
-        <w:t>createdBy</w:t>
-      </w:r>
-      <w:proofErr w:type="spellEnd"/>
-      <w:r>
-        <w:t xml:space="preserve"> intact (assistant-suggested)</w:t>
+        <w:rPr>
+          <w:rFonts w:eastAsia="ＭＳ Ｐゴシック"/>
+        </w:rPr>
+        <w:t>保持作成</w:t>
+      </w:r>
+      <w:r>
+        <w:rPr>
+          <w:rFonts w:eastAsia="ＭＳ Ｐゴシック"/>
+        </w:rPr>
+        <w:t>:intact(</w:t>
+      </w:r>
+      <w:r>
+        <w:rPr>
+          <w:rFonts w:eastAsia="ＭＳ Ｐゴシック"/>
+        </w:rPr>
+        <w:t>アシスタント推奨</w:t>
+      </w:r>
+      <w:r>
+        <w:rPr>
+          <w:rFonts w:eastAsia="ＭＳ Ｐゴシック"/>
+        </w:rPr>
+        <w:t>)</w:t>
       </w:r>
     </w:p>
     <w:p>
       <w:pPr>
         <w:numPr>
           <w:ilvl w:val="0"/>
-          <w:numId w:val="7"/>
+          <w:numId w:val="17"/>
         </w:numPr>
       </w:pPr>
       <w:r>
-        <w:t>suggestions must remain visually and logically distinct from accepted memory</w:t>
+        <w:rPr>
+          <w:rFonts w:eastAsia="ＭＳ Ｐゴシック"/>
+        </w:rPr>
+        <w:t>提案は視覚的にも論理的にも、受け入れられた記憶と区別されなければなりません</w:t>
       </w:r>
     </w:p>
     <w:p>
       <w:pPr>
         <w:numPr>
           <w:ilvl w:val="0"/>
-          <w:numId w:val="7"/>
+          <w:numId w:val="17"/>
         </w:numPr>
       </w:pPr>
       <w:r>
-        <w:t>do not change UI meaning</w:t>
-      </w:r>
-    </w:p>
-    <w:p>
-      <w:r>
-        <w:pict w14:anchorId="4666C146">
-          <v:rect id="_x0000_i1092" style="width:0;height:1.5pt" o:hralign="center" o:hrstd="t" o:hr="t" fillcolor="#a0a0a0" stroked="f">
+        <w:rPr>
+          <w:rFonts w:eastAsia="ＭＳ Ｐゴシック"/>
+        </w:rPr>
+        <w:t>UI</w:t>
+      </w:r>
+      <w:r>
+        <w:rPr>
+          <w:rFonts w:eastAsia="ＭＳ Ｐゴシック"/>
+        </w:rPr>
+        <w:t>の意味を変えないでください</w:t>
+      </w:r>
+    </w:p>
+    <w:p>
+      <w:r>
+        <w:pict w14:anchorId="0C08DDC7">
+          <v:rect id="_x0000_i1052" style="width:0;height:1.5pt" o:hralign="center" o:hrstd="t" o:hr="t" fillcolor="#a0a0a0" stroked="f">
             <v:textbox inset="5.85pt,.7pt,5.85pt,.7pt"/>
           </v:rect>
         </w:pict>
@@ -740,111 +1449,116 @@
       </w:pPr>
       <w:r>
         <w:rPr>
+          <w:rFonts w:eastAsia="SimSun"/>
           <w:b/>
           <w:bCs/>
         </w:rPr>
-        <w:t>Acceptance Criteria</w:t>
+        <w:t>受理基準</w:t>
       </w:r>
     </w:p>
     <w:p>
       <w:pPr>
         <w:numPr>
           <w:ilvl w:val="0"/>
-          <w:numId w:val="8"/>
+          <w:numId w:val="18"/>
         </w:numPr>
       </w:pPr>
       <w:r>
-        <w:t>duplicate suggestions are not added if already present in:</w:t>
+        <w:rPr>
+          <w:rFonts w:eastAsia="ＭＳ Ｐゴシック"/>
+        </w:rPr>
+        <w:t>重複提案は、すでに以下の場所にある場合は追加されません。</w:t>
       </w:r>
     </w:p>
     <w:p>
       <w:pPr>
         <w:numPr>
           <w:ilvl w:val="1"/>
-          <w:numId w:val="8"/>
+          <w:numId w:val="18"/>
         </w:numPr>
       </w:pPr>
       <w:r>
-        <w:t>durable</w:t>
+        <w:rPr>
+          <w:rFonts w:eastAsia="ＭＳ Ｐゴシック"/>
+        </w:rPr>
+        <w:lastRenderedPageBreak/>
+        <w:t>耐久性があります</w:t>
       </w:r>
     </w:p>
     <w:p>
       <w:pPr>
         <w:numPr>
           <w:ilvl w:val="1"/>
-          <w:numId w:val="8"/>
+          <w:numId w:val="18"/>
         </w:numPr>
       </w:pPr>
       <w:r>
-        <w:t>pending</w:t>
+        <w:rPr>
+          <w:rFonts w:eastAsia="SimSun"/>
+        </w:rPr>
+        <w:t>保留中</w:t>
       </w:r>
     </w:p>
     <w:p>
       <w:pPr>
         <w:numPr>
           <w:ilvl w:val="1"/>
-          <w:numId w:val="8"/>
+          <w:numId w:val="18"/>
         </w:numPr>
       </w:pPr>
       <w:r>
-        <w:t>current session suggestions</w:t>
+        <w:rPr>
+          <w:rFonts w:eastAsia="ＭＳ Ｐゴシック"/>
+        </w:rPr>
+        <w:t>現在の会期提案</w:t>
       </w:r>
     </w:p>
     <w:p>
       <w:pPr>
         <w:numPr>
           <w:ilvl w:val="0"/>
-          <w:numId w:val="8"/>
+          <w:numId w:val="18"/>
         </w:numPr>
       </w:pPr>
       <w:r>
-        <w:t>duplicate candidates within same generation batch are collapsed into one</w:t>
+        <w:rPr>
+          <w:rFonts w:eastAsia="ＭＳ Ｐゴシック"/>
+        </w:rPr>
+        <w:t>同じ世代バッチ内の重複候補は一つに統合されます</w:t>
       </w:r>
     </w:p>
     <w:p>
       <w:pPr>
         <w:numPr>
           <w:ilvl w:val="0"/>
-          <w:numId w:val="8"/>
+          <w:numId w:val="18"/>
         </w:numPr>
       </w:pPr>
       <w:r>
-        <w:t>suggestion flow remains explicitly user-triggered</w:t>
+        <w:rPr>
+          <w:rFonts w:eastAsia="ＭＳ Ｐゴシック"/>
+        </w:rPr>
+        <w:t>提案フローは明示的にユーザートリガーのままです</w:t>
       </w:r>
     </w:p>
     <w:p>
       <w:pPr>
         <w:numPr>
           <w:ilvl w:val="0"/>
-          <w:numId w:val="8"/>
+          <w:numId w:val="18"/>
         </w:numPr>
       </w:pPr>
-      <w:proofErr w:type="gramStart"/>
-      <w:r>
-        <w:t>no</w:t>
-      </w:r>
-      <w:proofErr w:type="gramEnd"/>
-      <w:r>
-        <w:t xml:space="preserve"> behavior </w:t>
-      </w:r>
-      <w:proofErr w:type="gramStart"/>
-      <w:r>
-        <w:t>change</w:t>
-      </w:r>
-      <w:proofErr w:type="gramEnd"/>
-      <w:r>
-        <w:t xml:space="preserve"> outside </w:t>
-      </w:r>
-      <w:proofErr w:type="gramStart"/>
-      <w:r>
-        <w:t>deduplication</w:t>
-      </w:r>
-      <w:proofErr w:type="gramEnd"/>
-    </w:p>
-    <w:p>
-      <w:r>
-        <w:pict w14:anchorId="6F117FE1">
-          <v:rect id="_x0000_i1093" style="width:0;height:1.5pt" o:hralign="center" o:hrstd="t" o:hr="t" fillcolor="#a0a0a0" stroked="f">
+      <w:r>
+        <w:rPr>
+          <w:rFonts w:eastAsia="ＭＳ Ｐゴシック"/>
+        </w:rPr>
+        <w:t>重複除去以外に行動の変化はありません</w:t>
+      </w:r>
+    </w:p>
+    <w:p>
+      <w:r>
+        <w:pict w14:anchorId="4B30D7D6">
+          <v:rect id="_x0000_i1053" style="width:0;height:1.5pt" o:hralign="center" o:hrstd="t" o:hr="t" fillcolor="#a0a0a0" stroked="f">
             <v:textbox inset="5.85pt,.7pt,5.85pt,.7pt"/>
           </v:rect>
         </w:pict>
@@ -859,63 +1573,79 @@
       </w:pPr>
       <w:r>
         <w:rPr>
+          <w:rFonts w:eastAsia="SimSun"/>
           <w:b/>
           <w:bCs/>
         </w:rPr>
-        <w:t>Validation</w:t>
-      </w:r>
-    </w:p>
-    <w:p>
-      <w:r>
-        <w:t>Run:</w:t>
+        <w:t>検証</w:t>
+      </w:r>
+    </w:p>
+    <w:p>
+      <w:r>
+        <w:rPr>
+          <w:rFonts w:eastAsia="ＭＳ Ｐゴシック"/>
+        </w:rPr>
+        <w:t>ラン</w:t>
+      </w:r>
+      <w:r>
+        <w:rPr>
+          <w:rFonts w:eastAsia="ＭＳ Ｐゴシック"/>
+        </w:rPr>
+        <w:t>:</w:t>
       </w:r>
     </w:p>
     <w:p>
       <w:pPr>
         <w:numPr>
           <w:ilvl w:val="0"/>
-          <w:numId w:val="9"/>
+          <w:numId w:val="19"/>
         </w:numPr>
       </w:pPr>
-      <w:proofErr w:type="spellStart"/>
-      <w:r>
-        <w:t>npm</w:t>
-      </w:r>
-      <w:proofErr w:type="spellEnd"/>
-      <w:r>
-        <w:t xml:space="preserve"> run </w:t>
-      </w:r>
-      <w:proofErr w:type="spellStart"/>
-      <w:r>
-        <w:t>typecheck</w:t>
-      </w:r>
-      <w:proofErr w:type="spellEnd"/>
+      <w:r>
+        <w:rPr>
+          <w:rFonts w:eastAsia="ＭＳ Ｐゴシック"/>
+        </w:rPr>
+        <w:t xml:space="preserve">NPM </w:t>
+      </w:r>
+      <w:r>
+        <w:rPr>
+          <w:rFonts w:eastAsia="ＭＳ Ｐゴシック"/>
+        </w:rPr>
+        <w:t>実行タイプチェック</w:t>
+      </w:r>
     </w:p>
     <w:p>
       <w:pPr>
         <w:numPr>
           <w:ilvl w:val="0"/>
-          <w:numId w:val="9"/>
+          <w:numId w:val="19"/>
         </w:numPr>
       </w:pPr>
-      <w:proofErr w:type="spellStart"/>
-      <w:r>
-        <w:t>npm</w:t>
-      </w:r>
-      <w:proofErr w:type="spellEnd"/>
-      <w:r>
-        <w:t xml:space="preserve"> run build</w:t>
-      </w:r>
-    </w:p>
-    <w:p>
-      <w:r>
-        <w:t>Both must pass.</w:t>
-      </w:r>
-    </w:p>
-    <w:p>
-      <w:r>
-        <w:pict w14:anchorId="0D63D8B2">
-          <v:rect id="_x0000_i1094" style="width:0;height:1.5pt" o:hralign="center" o:hrstd="t" o:hr="t" fillcolor="#a0a0a0" stroked="f">
+      <w:r>
+        <w:rPr>
+          <w:rFonts w:eastAsia="ＭＳ Ｐゴシック"/>
+        </w:rPr>
+        <w:t xml:space="preserve">NPM Run </w:t>
+      </w:r>
+      <w:r>
+        <w:rPr>
+          <w:rFonts w:eastAsia="ＭＳ Ｐゴシック"/>
+        </w:rPr>
+        <w:t>ビルド</w:t>
+      </w:r>
+    </w:p>
+    <w:p>
+      <w:r>
+        <w:rPr>
+          <w:rFonts w:eastAsia="ＭＳ Ｐゴシック"/>
+        </w:rPr>
+        <w:t>どちらも合格しなければならない。</w:t>
+      </w:r>
+    </w:p>
+    <w:p>
+      <w:r>
+        <w:pict w14:anchorId="2BD4FD97">
+          <v:rect id="_x0000_i1054" style="width:0;height:1.5pt" o:hralign="center" o:hrstd="t" o:hr="t" fillcolor="#a0a0a0" stroked="f">
             <v:textbox inset="5.85pt,.7pt,5.85pt,.7pt"/>
           </v:rect>
         </w:pict>
@@ -930,63 +1660,107 @@
       </w:pPr>
       <w:r>
         <w:rPr>
+          <w:rFonts w:eastAsia="ＭＳ Ｐゴシック"/>
           <w:b/>
           <w:bCs/>
         </w:rPr>
-        <w:t>Output Format</w:t>
+        <w:t>出力フォーマット</w:t>
       </w:r>
     </w:p>
     <w:p>
       <w:pPr>
         <w:numPr>
           <w:ilvl w:val="0"/>
-          <w:numId w:val="10"/>
+          <w:numId w:val="20"/>
         </w:numPr>
       </w:pPr>
       <w:r>
-        <w:t>Implementation summary (short)</w:t>
+        <w:rPr>
+          <w:rFonts w:eastAsia="ＭＳ Ｐゴシック"/>
+        </w:rPr>
+        <w:t>実装概要</w:t>
+      </w:r>
+      <w:r>
+        <w:rPr>
+          <w:rFonts w:eastAsia="ＭＳ Ｐゴシック"/>
+        </w:rPr>
+        <w:t>(</w:t>
+      </w:r>
+      <w:r>
+        <w:rPr>
+          <w:rFonts w:eastAsia="ＭＳ Ｐゴシック"/>
+        </w:rPr>
+        <w:t>短く</w:t>
+      </w:r>
+      <w:r>
+        <w:rPr>
+          <w:rFonts w:eastAsia="ＭＳ Ｐゴシック"/>
+        </w:rPr>
+        <w:t>)</w:t>
       </w:r>
     </w:p>
     <w:p>
       <w:pPr>
         <w:numPr>
           <w:ilvl w:val="0"/>
-          <w:numId w:val="10"/>
+          <w:numId w:val="20"/>
         </w:numPr>
       </w:pPr>
       <w:r>
-        <w:t>Touched files</w:t>
+        <w:rPr>
+          <w:rFonts w:eastAsia="ＭＳ Ｐゴシック"/>
+        </w:rPr>
+        <w:t>タッチドファイル</w:t>
       </w:r>
     </w:p>
     <w:p>
       <w:pPr>
         <w:numPr>
           <w:ilvl w:val="0"/>
-          <w:numId w:val="10"/>
+          <w:numId w:val="20"/>
         </w:numPr>
       </w:pPr>
       <w:r>
-        <w:t>Validation results</w:t>
+        <w:rPr>
+          <w:rFonts w:eastAsia="SimSun"/>
+        </w:rPr>
+        <w:t>検証結果</w:t>
       </w:r>
     </w:p>
     <w:p>
       <w:pPr>
         <w:numPr>
           <w:ilvl w:val="0"/>
-          <w:numId w:val="10"/>
+          <w:numId w:val="20"/>
         </w:numPr>
       </w:pPr>
       <w:r>
-        <w:t>If any constraint was difficult to follow, explain why (do NOT silently break rules)</w:t>
-      </w:r>
-    </w:p>
-    <w:p>
-      <w:pPr>
-        <w:rPr>
-          <w:rFonts w:hint="eastAsia"/>
-        </w:rPr>
-      </w:pPr>
-    </w:p>
+        <w:rPr>
+          <w:rFonts w:eastAsia="ＭＳ Ｐゴシック"/>
+        </w:rPr>
+        <w:t>もし守りづらい制約があれば、その理由を説明してください</w:t>
+      </w:r>
+      <w:r>
+        <w:rPr>
+          <w:rFonts w:eastAsia="ＭＳ Ｐゴシック"/>
+        </w:rPr>
+        <w:t>(</w:t>
+      </w:r>
+      <w:r>
+        <w:rPr>
+          <w:rFonts w:eastAsia="ＭＳ Ｐゴシック"/>
+        </w:rPr>
+        <w:t>絶対に黙ってルールを破らないでください</w:t>
+      </w:r>
+      <w:r>
+        <w:rPr>
+          <w:rFonts w:eastAsia="ＭＳ Ｐゴシック"/>
+        </w:rPr>
+        <w:t>)</w:t>
+      </w:r>
+    </w:p>
+    <w:p/>
+    <w:p/>
     <w:sectPr>
       <w:pgSz w:w="11906" w:h="16838"/>
       <w:pgMar w:top="1985" w:right="1701" w:bottom="1701" w:left="1701" w:header="851" w:footer="992" w:gutter="0"/>
@@ -1149,6 +1923,119 @@
     </w:lvl>
   </w:abstractNum>
   <w:abstractNum w:abstractNumId="1" w15:restartNumberingAfterBreak="0">
+    <w:nsid w:val="187A4731"/>
+    <w:multiLevelType w:val="multilevel"/>
+    <w:tmpl w:val="C21E93C0"/>
+    <w:lvl w:ilvl="0">
+      <w:start w:val="1"/>
+      <w:numFmt w:val="decimal"/>
+      <w:lvlText w:val="%1."/>
+      <w:lvlJc w:val="left"/>
+      <w:pPr>
+        <w:tabs>
+          <w:tab w:val="num" w:pos="720"/>
+        </w:tabs>
+        <w:ind w:left="720" w:hanging="720"/>
+      </w:pPr>
+    </w:lvl>
+    <w:lvl w:ilvl="1">
+      <w:start w:val="1"/>
+      <w:numFmt w:val="decimal"/>
+      <w:lvlText w:val="%2."/>
+      <w:lvlJc w:val="left"/>
+      <w:pPr>
+        <w:tabs>
+          <w:tab w:val="num" w:pos="1440"/>
+        </w:tabs>
+        <w:ind w:left="1440" w:hanging="720"/>
+      </w:pPr>
+    </w:lvl>
+    <w:lvl w:ilvl="2">
+      <w:start w:val="1"/>
+      <w:numFmt w:val="decimal"/>
+      <w:lvlText w:val="%3."/>
+      <w:lvlJc w:val="left"/>
+      <w:pPr>
+        <w:tabs>
+          <w:tab w:val="num" w:pos="2160"/>
+        </w:tabs>
+        <w:ind w:left="2160" w:hanging="720"/>
+      </w:pPr>
+    </w:lvl>
+    <w:lvl w:ilvl="3">
+      <w:start w:val="1"/>
+      <w:numFmt w:val="decimal"/>
+      <w:lvlText w:val="%4."/>
+      <w:lvlJc w:val="left"/>
+      <w:pPr>
+        <w:tabs>
+          <w:tab w:val="num" w:pos="2880"/>
+        </w:tabs>
+        <w:ind w:left="2880" w:hanging="720"/>
+      </w:pPr>
+    </w:lvl>
+    <w:lvl w:ilvl="4">
+      <w:start w:val="1"/>
+      <w:numFmt w:val="decimal"/>
+      <w:lvlText w:val="%5."/>
+      <w:lvlJc w:val="left"/>
+      <w:pPr>
+        <w:tabs>
+          <w:tab w:val="num" w:pos="3600"/>
+        </w:tabs>
+        <w:ind w:left="3600" w:hanging="720"/>
+      </w:pPr>
+    </w:lvl>
+    <w:lvl w:ilvl="5">
+      <w:start w:val="1"/>
+      <w:numFmt w:val="decimal"/>
+      <w:lvlText w:val="%6."/>
+      <w:lvlJc w:val="left"/>
+      <w:pPr>
+        <w:tabs>
+          <w:tab w:val="num" w:pos="4320"/>
+        </w:tabs>
+        <w:ind w:left="4320" w:hanging="720"/>
+      </w:pPr>
+    </w:lvl>
+    <w:lvl w:ilvl="6">
+      <w:start w:val="1"/>
+      <w:numFmt w:val="decimal"/>
+      <w:lvlText w:val="%7."/>
+      <w:lvlJc w:val="left"/>
+      <w:pPr>
+        <w:tabs>
+          <w:tab w:val="num" w:pos="5040"/>
+        </w:tabs>
+        <w:ind w:left="5040" w:hanging="720"/>
+      </w:pPr>
+    </w:lvl>
+    <w:lvl w:ilvl="7">
+      <w:start w:val="1"/>
+      <w:numFmt w:val="decimal"/>
+      <w:lvlText w:val="%8."/>
+      <w:lvlJc w:val="left"/>
+      <w:pPr>
+        <w:tabs>
+          <w:tab w:val="num" w:pos="5760"/>
+        </w:tabs>
+        <w:ind w:left="5760" w:hanging="720"/>
+      </w:pPr>
+    </w:lvl>
+    <w:lvl w:ilvl="8">
+      <w:start w:val="1"/>
+      <w:numFmt w:val="decimal"/>
+      <w:lvlText w:val="%9."/>
+      <w:lvlJc w:val="left"/>
+      <w:pPr>
+        <w:tabs>
+          <w:tab w:val="num" w:pos="6480"/>
+        </w:tabs>
+        <w:ind w:left="6480" w:hanging="720"/>
+      </w:pPr>
+    </w:lvl>
+  </w:abstractNum>
+  <w:abstractNum w:abstractNumId="2" w15:restartNumberingAfterBreak="0">
     <w:nsid w:val="19F50603"/>
     <w:multiLevelType w:val="multilevel"/>
     <w:tmpl w:val="A73418E2"/>
@@ -1297,7 +2184,156 @@
       </w:rPr>
     </w:lvl>
   </w:abstractNum>
-  <w:abstractNum w:abstractNumId="2" w15:restartNumberingAfterBreak="0">
+  <w:abstractNum w:abstractNumId="3" w15:restartNumberingAfterBreak="0">
+    <w:nsid w:val="389A1CBC"/>
+    <w:multiLevelType w:val="multilevel"/>
+    <w:tmpl w:val="11543BF6"/>
+    <w:lvl w:ilvl="0">
+      <w:start w:val="1"/>
+      <w:numFmt w:val="bullet"/>
+      <w:lvlText w:val=""/>
+      <w:lvlJc w:val="left"/>
+      <w:pPr>
+        <w:tabs>
+          <w:tab w:val="num" w:pos="720"/>
+        </w:tabs>
+        <w:ind w:left="720" w:hanging="360"/>
+      </w:pPr>
+      <w:rPr>
+        <w:rFonts w:ascii="Symbol" w:hAnsi="Symbol" w:hint="default"/>
+        <w:sz w:val="20"/>
+      </w:rPr>
+    </w:lvl>
+    <w:lvl w:ilvl="1" w:tentative="1">
+      <w:start w:val="1"/>
+      <w:numFmt w:val="bullet"/>
+      <w:lvlText w:val=""/>
+      <w:lvlJc w:val="left"/>
+      <w:pPr>
+        <w:tabs>
+          <w:tab w:val="num" w:pos="1440"/>
+        </w:tabs>
+        <w:ind w:left="1440" w:hanging="360"/>
+      </w:pPr>
+      <w:rPr>
+        <w:rFonts w:ascii="Symbol" w:hAnsi="Symbol" w:hint="default"/>
+        <w:sz w:val="20"/>
+      </w:rPr>
+    </w:lvl>
+    <w:lvl w:ilvl="2" w:tentative="1">
+      <w:start w:val="1"/>
+      <w:numFmt w:val="bullet"/>
+      <w:lvlText w:val=""/>
+      <w:lvlJc w:val="left"/>
+      <w:pPr>
+        <w:tabs>
+          <w:tab w:val="num" w:pos="2160"/>
+        </w:tabs>
+        <w:ind w:left="2160" w:hanging="360"/>
+      </w:pPr>
+      <w:rPr>
+        <w:rFonts w:ascii="Symbol" w:hAnsi="Symbol" w:hint="default"/>
+        <w:sz w:val="20"/>
+      </w:rPr>
+    </w:lvl>
+    <w:lvl w:ilvl="3" w:tentative="1">
+      <w:start w:val="1"/>
+      <w:numFmt w:val="bullet"/>
+      <w:lvlText w:val=""/>
+      <w:lvlJc w:val="left"/>
+      <w:pPr>
+        <w:tabs>
+          <w:tab w:val="num" w:pos="2880"/>
+        </w:tabs>
+        <w:ind w:left="2880" w:hanging="360"/>
+      </w:pPr>
+      <w:rPr>
+        <w:rFonts w:ascii="Symbol" w:hAnsi="Symbol" w:hint="default"/>
+        <w:sz w:val="20"/>
+      </w:rPr>
+    </w:lvl>
+    <w:lvl w:ilvl="4" w:tentative="1">
+      <w:start w:val="1"/>
+      <w:numFmt w:val="bullet"/>
+      <w:lvlText w:val=""/>
+      <w:lvlJc w:val="left"/>
+      <w:pPr>
+        <w:tabs>
+          <w:tab w:val="num" w:pos="3600"/>
+        </w:tabs>
+        <w:ind w:left="3600" w:hanging="360"/>
+      </w:pPr>
+      <w:rPr>
+        <w:rFonts w:ascii="Symbol" w:hAnsi="Symbol" w:hint="default"/>
+        <w:sz w:val="20"/>
+      </w:rPr>
+    </w:lvl>
+    <w:lvl w:ilvl="5" w:tentative="1">
+      <w:start w:val="1"/>
+      <w:numFmt w:val="bullet"/>
+      <w:lvlText w:val=""/>
+      <w:lvlJc w:val="left"/>
+      <w:pPr>
+        <w:tabs>
+          <w:tab w:val="num" w:pos="4320"/>
+        </w:tabs>
+        <w:ind w:left="4320" w:hanging="360"/>
+      </w:pPr>
+      <w:rPr>
+        <w:rFonts w:ascii="Symbol" w:hAnsi="Symbol" w:hint="default"/>
+        <w:sz w:val="20"/>
+      </w:rPr>
+    </w:lvl>
+    <w:lvl w:ilvl="6" w:tentative="1">
+      <w:start w:val="1"/>
+      <w:numFmt w:val="bullet"/>
+      <w:lvlText w:val=""/>
+      <w:lvlJc w:val="left"/>
+      <w:pPr>
+        <w:tabs>
+          <w:tab w:val="num" w:pos="5040"/>
+        </w:tabs>
+        <w:ind w:left="5040" w:hanging="360"/>
+      </w:pPr>
+      <w:rPr>
+        <w:rFonts w:ascii="Symbol" w:hAnsi="Symbol" w:hint="default"/>
+        <w:sz w:val="20"/>
+      </w:rPr>
+    </w:lvl>
+    <w:lvl w:ilvl="7" w:tentative="1">
+      <w:start w:val="1"/>
+      <w:numFmt w:val="bullet"/>
+      <w:lvlText w:val=""/>
+      <w:lvlJc w:val="left"/>
+      <w:pPr>
+        <w:tabs>
+          <w:tab w:val="num" w:pos="5760"/>
+        </w:tabs>
+        <w:ind w:left="5760" w:hanging="360"/>
+      </w:pPr>
+      <w:rPr>
+        <w:rFonts w:ascii="Symbol" w:hAnsi="Symbol" w:hint="default"/>
+        <w:sz w:val="20"/>
+      </w:rPr>
+    </w:lvl>
+    <w:lvl w:ilvl="8" w:tentative="1">
+      <w:start w:val="1"/>
+      <w:numFmt w:val="bullet"/>
+      <w:lvlText w:val=""/>
+      <w:lvlJc w:val="left"/>
+      <w:pPr>
+        <w:tabs>
+          <w:tab w:val="num" w:pos="6480"/>
+        </w:tabs>
+        <w:ind w:left="6480" w:hanging="360"/>
+      </w:pPr>
+      <w:rPr>
+        <w:rFonts w:ascii="Symbol" w:hAnsi="Symbol" w:hint="default"/>
+        <w:sz w:val="20"/>
+      </w:rPr>
+    </w:lvl>
+  </w:abstractNum>
+  <w:abstractNum w:abstractNumId="4" w15:restartNumberingAfterBreak="0">
     <w:nsid w:val="3D60446B"/>
     <w:multiLevelType w:val="multilevel"/>
     <w:tmpl w:val="0CD6C116"/>
@@ -1446,7 +2482,7 @@
       </w:rPr>
     </w:lvl>
   </w:abstractNum>
-  <w:abstractNum w:abstractNumId="3" w15:restartNumberingAfterBreak="0">
+  <w:abstractNum w:abstractNumId="5" w15:restartNumberingAfterBreak="0">
     <w:nsid w:val="470D08D2"/>
     <w:multiLevelType w:val="multilevel"/>
     <w:tmpl w:val="28A004B4"/>
@@ -1595,7 +2631,7 @@
       </w:rPr>
     </w:lvl>
   </w:abstractNum>
-  <w:abstractNum w:abstractNumId="4" w15:restartNumberingAfterBreak="0">
+  <w:abstractNum w:abstractNumId="6" w15:restartNumberingAfterBreak="0">
     <w:nsid w:val="5586500A"/>
     <w:multiLevelType w:val="multilevel"/>
     <w:tmpl w:val="9454BFD2"/>
@@ -1744,7 +2780,7 @@
       </w:rPr>
     </w:lvl>
   </w:abstractNum>
-  <w:abstractNum w:abstractNumId="5" w15:restartNumberingAfterBreak="0">
+  <w:abstractNum w:abstractNumId="7" w15:restartNumberingAfterBreak="0">
     <w:nsid w:val="6552414C"/>
     <w:multiLevelType w:val="multilevel"/>
     <w:tmpl w:val="7C460B62"/>
@@ -1893,7 +2929,7 @@
       </w:rPr>
     </w:lvl>
   </w:abstractNum>
-  <w:abstractNum w:abstractNumId="6" w15:restartNumberingAfterBreak="0">
+  <w:abstractNum w:abstractNumId="8" w15:restartNumberingAfterBreak="0">
     <w:nsid w:val="68584C36"/>
     <w:multiLevelType w:val="multilevel"/>
     <w:tmpl w:val="03E4B21A"/>
@@ -2042,7 +3078,7 @@
       </w:rPr>
     </w:lvl>
   </w:abstractNum>
-  <w:abstractNum w:abstractNumId="7" w15:restartNumberingAfterBreak="0">
+  <w:abstractNum w:abstractNumId="9" w15:restartNumberingAfterBreak="0">
     <w:nsid w:val="686A02EB"/>
     <w:multiLevelType w:val="multilevel"/>
     <w:tmpl w:val="3CB6817C"/>
@@ -2191,7 +3227,7 @@
       </w:rPr>
     </w:lvl>
   </w:abstractNum>
-  <w:abstractNum w:abstractNumId="8" w15:restartNumberingAfterBreak="0">
+  <w:abstractNum w:abstractNumId="10" w15:restartNumberingAfterBreak="0">
     <w:nsid w:val="6DDC587F"/>
     <w:multiLevelType w:val="multilevel"/>
     <w:tmpl w:val="A8565D32"/>
@@ -2304,7 +3340,7 @@
       </w:pPr>
     </w:lvl>
   </w:abstractNum>
-  <w:abstractNum w:abstractNumId="9" w15:restartNumberingAfterBreak="0">
+  <w:abstractNum w:abstractNumId="11" w15:restartNumberingAfterBreak="0">
     <w:nsid w:val="7A4921C9"/>
     <w:multiLevelType w:val="multilevel"/>
     <w:tmpl w:val="C5143796"/>
@@ -2454,34 +3490,310 @@
     </w:lvl>
   </w:abstractNum>
   <w:num w:numId="1" w16cid:durableId="57821635">
-    <w:abstractNumId w:val="9"/>
+    <w:abstractNumId w:val="11"/>
   </w:num>
   <w:num w:numId="2" w16cid:durableId="2040470220">
     <w:abstractNumId w:val="0"/>
   </w:num>
   <w:num w:numId="3" w16cid:durableId="270011085">
+    <w:abstractNumId w:val="4"/>
+  </w:num>
+  <w:num w:numId="4" w16cid:durableId="1928804404">
     <w:abstractNumId w:val="2"/>
   </w:num>
-  <w:num w:numId="4" w16cid:durableId="1928804404">
+  <w:num w:numId="5" w16cid:durableId="428621687">
+    <w:abstractNumId w:val="7"/>
+  </w:num>
+  <w:num w:numId="6" w16cid:durableId="86851679">
+    <w:abstractNumId w:val="9"/>
+  </w:num>
+  <w:num w:numId="7" w16cid:durableId="1679961709">
+    <w:abstractNumId w:val="5"/>
+  </w:num>
+  <w:num w:numId="8" w16cid:durableId="1114207429">
+    <w:abstractNumId w:val="6"/>
+  </w:num>
+  <w:num w:numId="9" w16cid:durableId="499853954">
+    <w:abstractNumId w:val="8"/>
+  </w:num>
+  <w:num w:numId="10" w16cid:durableId="1483765660">
+    <w:abstractNumId w:val="10"/>
+  </w:num>
+  <w:num w:numId="11" w16cid:durableId="1521360007">
     <w:abstractNumId w:val="1"/>
   </w:num>
-  <w:num w:numId="5" w16cid:durableId="428621687">
-    <w:abstractNumId w:val="5"/>
+  <w:num w:numId="12" w16cid:durableId="306400980">
+    <w:abstractNumId w:val="1"/>
+    <w:lvlOverride w:ilvl="0">
+      <w:startOverride w:val="1"/>
+    </w:lvlOverride>
+    <w:lvlOverride w:ilvl="1">
+      <w:startOverride w:val="1"/>
+    </w:lvlOverride>
+    <w:lvlOverride w:ilvl="2">
+      <w:startOverride w:val="1"/>
+    </w:lvlOverride>
+    <w:lvlOverride w:ilvl="3">
+      <w:startOverride w:val="1"/>
+    </w:lvlOverride>
+    <w:lvlOverride w:ilvl="4">
+      <w:startOverride w:val="1"/>
+    </w:lvlOverride>
+    <w:lvlOverride w:ilvl="5">
+      <w:startOverride w:val="1"/>
+    </w:lvlOverride>
+    <w:lvlOverride w:ilvl="6">
+      <w:startOverride w:val="1"/>
+    </w:lvlOverride>
+    <w:lvlOverride w:ilvl="7">
+      <w:startOverride w:val="1"/>
+    </w:lvlOverride>
+    <w:lvlOverride w:ilvl="8">
+      <w:startOverride w:val="1"/>
+    </w:lvlOverride>
   </w:num>
-  <w:num w:numId="6" w16cid:durableId="86851679">
-    <w:abstractNumId w:val="7"/>
+  <w:num w:numId="13" w16cid:durableId="502623112">
+    <w:abstractNumId w:val="1"/>
+    <w:lvlOverride w:ilvl="0">
+      <w:startOverride w:val="1"/>
+    </w:lvlOverride>
+    <w:lvlOverride w:ilvl="1">
+      <w:startOverride w:val="1"/>
+    </w:lvlOverride>
+    <w:lvlOverride w:ilvl="2">
+      <w:startOverride w:val="1"/>
+    </w:lvlOverride>
+    <w:lvlOverride w:ilvl="3">
+      <w:startOverride w:val="1"/>
+    </w:lvlOverride>
+    <w:lvlOverride w:ilvl="4">
+      <w:startOverride w:val="1"/>
+    </w:lvlOverride>
+    <w:lvlOverride w:ilvl="5">
+      <w:startOverride w:val="1"/>
+    </w:lvlOverride>
+    <w:lvlOverride w:ilvl="6">
+      <w:startOverride w:val="1"/>
+    </w:lvlOverride>
+    <w:lvlOverride w:ilvl="7">
+      <w:startOverride w:val="1"/>
+    </w:lvlOverride>
+    <w:lvlOverride w:ilvl="8">
+      <w:startOverride w:val="1"/>
+    </w:lvlOverride>
   </w:num>
-  <w:num w:numId="7" w16cid:durableId="1679961709">
+  <w:num w:numId="14" w16cid:durableId="1524827534">
+    <w:abstractNumId w:val="1"/>
+    <w:lvlOverride w:ilvl="0">
+      <w:startOverride w:val="1"/>
+    </w:lvlOverride>
+    <w:lvlOverride w:ilvl="1">
+      <w:startOverride w:val="1"/>
+    </w:lvlOverride>
+    <w:lvlOverride w:ilvl="2">
+      <w:startOverride w:val="1"/>
+    </w:lvlOverride>
+    <w:lvlOverride w:ilvl="3">
+      <w:startOverride w:val="1"/>
+    </w:lvlOverride>
+    <w:lvlOverride w:ilvl="4">
+      <w:startOverride w:val="1"/>
+    </w:lvlOverride>
+    <w:lvlOverride w:ilvl="5">
+      <w:startOverride w:val="1"/>
+    </w:lvlOverride>
+    <w:lvlOverride w:ilvl="6">
+      <w:startOverride w:val="1"/>
+    </w:lvlOverride>
+    <w:lvlOverride w:ilvl="7">
+      <w:startOverride w:val="1"/>
+    </w:lvlOverride>
+    <w:lvlOverride w:ilvl="8">
+      <w:startOverride w:val="1"/>
+    </w:lvlOverride>
+  </w:num>
+  <w:num w:numId="15" w16cid:durableId="1857233410">
+    <w:abstractNumId w:val="1"/>
+    <w:lvlOverride w:ilvl="0">
+      <w:startOverride w:val="1"/>
+    </w:lvlOverride>
+    <w:lvlOverride w:ilvl="1">
+      <w:startOverride w:val="1"/>
+    </w:lvlOverride>
+    <w:lvlOverride w:ilvl="2">
+      <w:startOverride w:val="1"/>
+    </w:lvlOverride>
+    <w:lvlOverride w:ilvl="3">
+      <w:startOverride w:val="1"/>
+    </w:lvlOverride>
+    <w:lvlOverride w:ilvl="4">
+      <w:startOverride w:val="1"/>
+    </w:lvlOverride>
+    <w:lvlOverride w:ilvl="5">
+      <w:startOverride w:val="1"/>
+    </w:lvlOverride>
+    <w:lvlOverride w:ilvl="6">
+      <w:startOverride w:val="1"/>
+    </w:lvlOverride>
+    <w:lvlOverride w:ilvl="7">
+      <w:startOverride w:val="1"/>
+    </w:lvlOverride>
+    <w:lvlOverride w:ilvl="8">
+      <w:startOverride w:val="1"/>
+    </w:lvlOverride>
+  </w:num>
+  <w:num w:numId="16" w16cid:durableId="1314289049">
+    <w:abstractNumId w:val="1"/>
+    <w:lvlOverride w:ilvl="0">
+      <w:startOverride w:val="1"/>
+    </w:lvlOverride>
+    <w:lvlOverride w:ilvl="1">
+      <w:startOverride w:val="1"/>
+    </w:lvlOverride>
+    <w:lvlOverride w:ilvl="2">
+      <w:startOverride w:val="1"/>
+    </w:lvlOverride>
+    <w:lvlOverride w:ilvl="3">
+      <w:startOverride w:val="1"/>
+    </w:lvlOverride>
+    <w:lvlOverride w:ilvl="4">
+      <w:startOverride w:val="1"/>
+    </w:lvlOverride>
+    <w:lvlOverride w:ilvl="5">
+      <w:startOverride w:val="1"/>
+    </w:lvlOverride>
+    <w:lvlOverride w:ilvl="6">
+      <w:startOverride w:val="1"/>
+    </w:lvlOverride>
+    <w:lvlOverride w:ilvl="7">
+      <w:startOverride w:val="1"/>
+    </w:lvlOverride>
+    <w:lvlOverride w:ilvl="8">
+      <w:startOverride w:val="1"/>
+    </w:lvlOverride>
+  </w:num>
+  <w:num w:numId="17" w16cid:durableId="1398169997">
+    <w:abstractNumId w:val="1"/>
+    <w:lvlOverride w:ilvl="0">
+      <w:startOverride w:val="1"/>
+    </w:lvlOverride>
+    <w:lvlOverride w:ilvl="1">
+      <w:startOverride w:val="1"/>
+    </w:lvlOverride>
+    <w:lvlOverride w:ilvl="2">
+      <w:startOverride w:val="1"/>
+    </w:lvlOverride>
+    <w:lvlOverride w:ilvl="3">
+      <w:startOverride w:val="1"/>
+    </w:lvlOverride>
+    <w:lvlOverride w:ilvl="4">
+      <w:startOverride w:val="1"/>
+    </w:lvlOverride>
+    <w:lvlOverride w:ilvl="5">
+      <w:startOverride w:val="1"/>
+    </w:lvlOverride>
+    <w:lvlOverride w:ilvl="6">
+      <w:startOverride w:val="1"/>
+    </w:lvlOverride>
+    <w:lvlOverride w:ilvl="7">
+      <w:startOverride w:val="1"/>
+    </w:lvlOverride>
+    <w:lvlOverride w:ilvl="8">
+      <w:startOverride w:val="1"/>
+    </w:lvlOverride>
+  </w:num>
+  <w:num w:numId="18" w16cid:durableId="428082464">
+    <w:abstractNumId w:val="1"/>
+    <w:lvlOverride w:ilvl="0">
+      <w:startOverride w:val="1"/>
+    </w:lvlOverride>
+    <w:lvlOverride w:ilvl="1">
+      <w:startOverride w:val="1"/>
+    </w:lvlOverride>
+    <w:lvlOverride w:ilvl="2">
+      <w:startOverride w:val="1"/>
+    </w:lvlOverride>
+    <w:lvlOverride w:ilvl="3">
+      <w:startOverride w:val="1"/>
+    </w:lvlOverride>
+    <w:lvlOverride w:ilvl="4">
+      <w:startOverride w:val="1"/>
+    </w:lvlOverride>
+    <w:lvlOverride w:ilvl="5">
+      <w:startOverride w:val="1"/>
+    </w:lvlOverride>
+    <w:lvlOverride w:ilvl="6">
+      <w:startOverride w:val="1"/>
+    </w:lvlOverride>
+    <w:lvlOverride w:ilvl="7">
+      <w:startOverride w:val="1"/>
+    </w:lvlOverride>
+    <w:lvlOverride w:ilvl="8">
+      <w:startOverride w:val="1"/>
+    </w:lvlOverride>
+  </w:num>
+  <w:num w:numId="19" w16cid:durableId="1831629356">
+    <w:abstractNumId w:val="1"/>
+    <w:lvlOverride w:ilvl="0">
+      <w:startOverride w:val="1"/>
+    </w:lvlOverride>
+    <w:lvlOverride w:ilvl="1">
+      <w:startOverride w:val="1"/>
+    </w:lvlOverride>
+    <w:lvlOverride w:ilvl="2">
+      <w:startOverride w:val="1"/>
+    </w:lvlOverride>
+    <w:lvlOverride w:ilvl="3">
+      <w:startOverride w:val="1"/>
+    </w:lvlOverride>
+    <w:lvlOverride w:ilvl="4">
+      <w:startOverride w:val="1"/>
+    </w:lvlOverride>
+    <w:lvlOverride w:ilvl="5">
+      <w:startOverride w:val="1"/>
+    </w:lvlOverride>
+    <w:lvlOverride w:ilvl="6">
+      <w:startOverride w:val="1"/>
+    </w:lvlOverride>
+    <w:lvlOverride w:ilvl="7">
+      <w:startOverride w:val="1"/>
+    </w:lvlOverride>
+    <w:lvlOverride w:ilvl="8">
+      <w:startOverride w:val="1"/>
+    </w:lvlOverride>
+  </w:num>
+  <w:num w:numId="20" w16cid:durableId="367099584">
+    <w:abstractNumId w:val="1"/>
+    <w:lvlOverride w:ilvl="0">
+      <w:startOverride w:val="1"/>
+    </w:lvlOverride>
+    <w:lvlOverride w:ilvl="1">
+      <w:startOverride w:val="1"/>
+    </w:lvlOverride>
+    <w:lvlOverride w:ilvl="2">
+      <w:startOverride w:val="1"/>
+    </w:lvlOverride>
+    <w:lvlOverride w:ilvl="3">
+      <w:startOverride w:val="1"/>
+    </w:lvlOverride>
+    <w:lvlOverride w:ilvl="4">
+      <w:startOverride w:val="1"/>
+    </w:lvlOverride>
+    <w:lvlOverride w:ilvl="5">
+      <w:startOverride w:val="1"/>
+    </w:lvlOverride>
+    <w:lvlOverride w:ilvl="6">
+      <w:startOverride w:val="1"/>
+    </w:lvlOverride>
+    <w:lvlOverride w:ilvl="7">
+      <w:startOverride w:val="1"/>
+    </w:lvlOverride>
+    <w:lvlOverride w:ilvl="8">
+      <w:startOverride w:val="1"/>
+    </w:lvlOverride>
+  </w:num>
+  <w:num w:numId="21" w16cid:durableId="1650400142">
     <w:abstractNumId w:val="3"/>
-  </w:num>
-  <w:num w:numId="8" w16cid:durableId="1114207429">
-    <w:abstractNumId w:val="4"/>
-  </w:num>
-  <w:num w:numId="9" w16cid:durableId="499853954">
-    <w:abstractNumId w:val="6"/>
-  </w:num>
-  <w:num w:numId="10" w16cid:durableId="1483765660">
-    <w:abstractNumId w:val="8"/>
   </w:num>
 </w:numbering>
 </file>

</xml_diff>